<commit_message>
Encoding vs Conversion vs Decoding in buffer.from()
</commit_message>
<xml_diff>
--- a/node-js/Buffer From Encoding.docx
+++ b/node-js/Buffer From Encoding.docx
@@ -3031,7 +3031,7 @@
           </mc:Choice>
           <mc:Fallback>
             <w:pict>
-              <v:rect w14:anchorId="66E36FDC" id="Rectangle 41" o:spid="_x0000_s1026" style="width:24pt;height:24pt;visibility:visible;mso-wrap-style:square;mso-left-percent:-10001;mso-top-percent:-10001;mso-position-horizontal:absolute;mso-position-horizontal-relative:char;mso-position-vertical:absolute;mso-position-vertical-relative:line;mso-left-percent:-10001;mso-top-percent:-10001;v-text-anchor:top" o:gfxdata="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" filled="f" stroked="f">
+              <v:rect w14:anchorId="195B86CA" id="Rectangle 41" o:spid="_x0000_s1026" style="width:24pt;height:24pt;visibility:visible;mso-wrap-style:square;mso-left-percent:-10001;mso-top-percent:-10001;mso-position-horizontal:absolute;mso-position-horizontal-relative:char;mso-position-vertical:absolute;mso-position-vertical-relative:line;mso-left-percent:-10001;mso-top-percent:-10001;v-text-anchor:top" o:gfxdata="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" filled="f" stroked="f">
                 <o:lock v:ext="edit" aspectratio="t"/>
                 <w10:anchorlock/>
               </v:rect>
@@ -3384,7 +3384,7 @@
           </mc:Choice>
           <mc:Fallback>
             <w:pict>
-              <v:rect w14:anchorId="43EDB795" id="Rectangle 36" o:spid="_x0000_s1026" style="width:24pt;height:24pt;visibility:visible;mso-wrap-style:square;mso-left-percent:-10001;mso-top-percent:-10001;mso-position-horizontal:absolute;mso-position-horizontal-relative:char;mso-position-vertical:absolute;mso-position-vertical-relative:line;mso-left-percent:-10001;mso-top-percent:-10001;v-text-anchor:top" o:gfxdata="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" filled="f" stroked="f">
+              <v:rect w14:anchorId="443808DD" id="Rectangle 36" o:spid="_x0000_s1026" style="width:24pt;height:24pt;visibility:visible;mso-wrap-style:square;mso-left-percent:-10001;mso-top-percent:-10001;mso-position-horizontal:absolute;mso-position-horizontal-relative:char;mso-position-vertical:absolute;mso-position-vertical-relative:line;mso-left-percent:-10001;mso-top-percent:-10001;v-text-anchor:top" o:gfxdata="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" filled="f" stroked="f">
                 <o:lock v:ext="edit" aspectratio="t"/>
                 <w10:anchorlock/>
               </v:rect>
@@ -6899,7 +6899,7 @@
           </mc:Choice>
           <mc:Fallback>
             <w:pict>
-              <v:rect w14:anchorId="3FD4098B" id="Rectangle 110" o:spid="_x0000_s1026" style="width:24pt;height:24pt;visibility:visible;mso-wrap-style:square;mso-left-percent:-10001;mso-top-percent:-10001;mso-position-horizontal:absolute;mso-position-horizontal-relative:char;mso-position-vertical:absolute;mso-position-vertical-relative:line;mso-left-percent:-10001;mso-top-percent:-10001;v-text-anchor:top" o:gfxdata="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" filled="f" stroked="f">
+              <v:rect w14:anchorId="3250EBE6" id="Rectangle 110" o:spid="_x0000_s1026" style="width:24pt;height:24pt;visibility:visible;mso-wrap-style:square;mso-left-percent:-10001;mso-top-percent:-10001;mso-position-horizontal:absolute;mso-position-horizontal-relative:char;mso-position-vertical:absolute;mso-position-vertical-relative:line;mso-left-percent:-10001;mso-top-percent:-10001;v-text-anchor:top" o:gfxdata="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" filled="f" stroked="f">
                 <o:lock v:ext="edit" aspectratio="t"/>
                 <w10:anchorlock/>
               </v:rect>
@@ -7143,7 +7143,7 @@
           </mc:Choice>
           <mc:Fallback>
             <w:pict>
-              <v:rect w14:anchorId="4E606DC3" id="Rectangle 106" o:spid="_x0000_s1026" style="width:24pt;height:24pt;visibility:visible;mso-wrap-style:square;mso-left-percent:-10001;mso-top-percent:-10001;mso-position-horizontal:absolute;mso-position-horizontal-relative:char;mso-position-vertical:absolute;mso-position-vertical-relative:line;mso-left-percent:-10001;mso-top-percent:-10001;v-text-anchor:top" o:gfxdata="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" filled="f" stroked="f">
+              <v:rect w14:anchorId="176461B9" id="Rectangle 106" o:spid="_x0000_s1026" style="width:24pt;height:24pt;visibility:visible;mso-wrap-style:square;mso-left-percent:-10001;mso-top-percent:-10001;mso-position-horizontal:absolute;mso-position-horizontal-relative:char;mso-position-vertical:absolute;mso-position-vertical-relative:line;mso-left-percent:-10001;mso-top-percent:-10001;v-text-anchor:top" o:gfxdata="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" filled="f" stroked="f">
                 <o:lock v:ext="edit" aspectratio="t"/>
                 <w10:anchorlock/>
               </v:rect>
@@ -10851,7 +10851,7 @@
           </mc:Choice>
           <mc:Fallback>
             <w:pict>
-              <v:rect w14:anchorId="699AC7D1" id="Rectangle 86" o:spid="_x0000_s1026" style="width:24pt;height:24pt;visibility:visible;mso-wrap-style:square;mso-left-percent:-10001;mso-top-percent:-10001;mso-position-horizontal:absolute;mso-position-horizontal-relative:char;mso-position-vertical:absolute;mso-position-vertical-relative:line;mso-left-percent:-10001;mso-top-percent:-10001;v-text-anchor:top" o:gfxdata="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" filled="f" stroked="f">
+              <v:rect w14:anchorId="6B2B94DA" id="Rectangle 86" o:spid="_x0000_s1026" style="width:24pt;height:24pt;visibility:visible;mso-wrap-style:square;mso-left-percent:-10001;mso-top-percent:-10001;mso-position-horizontal:absolute;mso-position-horizontal-relative:char;mso-position-vertical:absolute;mso-position-vertical-relative:line;mso-left-percent:-10001;mso-top-percent:-10001;v-text-anchor:top" o:gfxdata="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" filled="f" stroked="f">
                 <o:lock v:ext="edit" aspectratio="t"/>
                 <w10:anchorlock/>
               </v:rect>
@@ -11224,7 +11224,7 @@
           </mc:Choice>
           <mc:Fallback>
             <w:pict>
-              <v:rect w14:anchorId="3BAB9E36" id="Rectangle 81" o:spid="_x0000_s1026" style="width:24pt;height:24pt;visibility:visible;mso-wrap-style:square;mso-left-percent:-10001;mso-top-percent:-10001;mso-position-horizontal:absolute;mso-position-horizontal-relative:char;mso-position-vertical:absolute;mso-position-vertical-relative:line;mso-left-percent:-10001;mso-top-percent:-10001;v-text-anchor:top" o:gfxdata="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" filled="f" stroked="f">
+              <v:rect w14:anchorId="41DEA53E" id="Rectangle 81" o:spid="_x0000_s1026" style="width:24pt;height:24pt;visibility:visible;mso-wrap-style:square;mso-left-percent:-10001;mso-top-percent:-10001;mso-position-horizontal:absolute;mso-position-horizontal-relative:char;mso-position-vertical:absolute;mso-position-vertical-relative:line;mso-left-percent:-10001;mso-top-percent:-10001;v-text-anchor:top" o:gfxdata="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" filled="f" stroked="f">
                 <o:lock v:ext="edit" aspectratio="t"/>
                 <w10:anchorlock/>
               </v:rect>
@@ -11807,6 +11807,1479 @@
         <w:t xml:space="preserve"> in bytes?</w:t>
       </w:r>
     </w:p>
+    <w:p>
+      <w:pPr>
+        <w:pBdr>
+          <w:bottom w:val="dotted" w:sz="24" w:space="1" w:color="auto"/>
+        </w:pBdr>
+      </w:pPr>
+    </w:p>
+    <w:p>
+      <w:pPr>
+        <w:rPr>
+          <w:b/>
+          <w:bCs/>
+          <w:color w:val="FF0000"/>
+          <w:sz w:val="32"/>
+          <w:szCs w:val="32"/>
+        </w:rPr>
+      </w:pPr>
+    </w:p>
+    <w:p>
+      <w:pPr>
+        <w:jc w:val="center"/>
+        <w:rPr>
+          <w:b/>
+          <w:bCs/>
+          <w:sz w:val="32"/>
+          <w:szCs w:val="32"/>
+        </w:rPr>
+      </w:pPr>
+      <w:r>
+        <w:rPr>
+          <w:b/>
+          <w:bCs/>
+          <w:sz w:val="32"/>
+          <w:szCs w:val="32"/>
+        </w:rPr>
+        <w:t xml:space="preserve">Encoding vs Conversion vs Decoding in buffer </w:t>
+      </w:r>
+      <w:proofErr w:type="gramStart"/>
+      <w:r>
+        <w:rPr>
+          <w:b/>
+          <w:bCs/>
+          <w:sz w:val="32"/>
+          <w:szCs w:val="32"/>
+        </w:rPr>
+        <w:t>from(</w:t>
+      </w:r>
+      <w:proofErr w:type="gramEnd"/>
+      <w:r>
+        <w:rPr>
+          <w:b/>
+          <w:bCs/>
+          <w:sz w:val="32"/>
+          <w:szCs w:val="32"/>
+        </w:rPr>
+        <w:t>)</w:t>
+      </w:r>
+    </w:p>
+    <w:p>
+      <w:pPr>
+        <w:jc w:val="center"/>
+        <w:rPr>
+          <w:b/>
+          <w:bCs/>
+          <w:sz w:val="28"/>
+          <w:szCs w:val="28"/>
+        </w:rPr>
+      </w:pPr>
+      <w:r>
+        <w:rPr>
+          <w:b/>
+          <w:bCs/>
+          <w:sz w:val="28"/>
+          <w:szCs w:val="28"/>
+        </w:rPr>
+        <w:t>(</w:t>
+      </w:r>
+      <w:r>
+        <w:rPr>
+          <w:b/>
+          <w:bCs/>
+          <w:sz w:val="28"/>
+          <w:szCs w:val="28"/>
+        </w:rPr>
+        <w:t>Encoding vs Conversion vs Decoding in buffer from</w:t>
+      </w:r>
+      <w:r>
+        <w:rPr>
+          <w:b/>
+          <w:bCs/>
+          <w:sz w:val="28"/>
+          <w:szCs w:val="28"/>
+        </w:rPr>
+        <w:t xml:space="preserve"> – google -ss)</w:t>
+      </w:r>
+    </w:p>
+    <w:p>
+      <w:pPr>
+        <w:rPr>
+          <w:sz w:val="28"/>
+          <w:szCs w:val="28"/>
+        </w:rPr>
+      </w:pPr>
+      <w:r>
+        <w:rPr>
+          <w:sz w:val="28"/>
+          <w:szCs w:val="28"/>
+        </w:rPr>
+        <w:t xml:space="preserve">In programming, </w:t>
+      </w:r>
+      <w:r>
+        <w:rPr>
+          <w:b/>
+          <w:bCs/>
+          <w:sz w:val="28"/>
+          <w:szCs w:val="28"/>
+        </w:rPr>
+        <w:t>encoding</w:t>
+      </w:r>
+      <w:r>
+        <w:rPr>
+          <w:sz w:val="28"/>
+          <w:szCs w:val="28"/>
+        </w:rPr>
+        <w:t xml:space="preserve">, </w:t>
+      </w:r>
+      <w:r>
+        <w:rPr>
+          <w:b/>
+          <w:bCs/>
+          <w:sz w:val="28"/>
+          <w:szCs w:val="28"/>
+        </w:rPr>
+        <w:t>conversion</w:t>
+      </w:r>
+      <w:r>
+        <w:rPr>
+          <w:sz w:val="28"/>
+          <w:szCs w:val="28"/>
+        </w:rPr>
+        <w:t xml:space="preserve">, and </w:t>
+      </w:r>
+      <w:r>
+        <w:rPr>
+          <w:b/>
+          <w:bCs/>
+          <w:sz w:val="28"/>
+          <w:szCs w:val="28"/>
+        </w:rPr>
+        <w:t>decoding</w:t>
+      </w:r>
+      <w:r>
+        <w:rPr>
+          <w:sz w:val="28"/>
+          <w:szCs w:val="28"/>
+        </w:rPr>
+        <w:t xml:space="preserve"> refer to how data translates between readable text and raw binary bytes. When using methods like </w:t>
+      </w:r>
+      <w:proofErr w:type="spellStart"/>
+      <w:r>
+        <w:rPr>
+          <w:sz w:val="28"/>
+          <w:szCs w:val="28"/>
+        </w:rPr>
+        <w:t>Buffer.from</w:t>
+      </w:r>
+      <w:proofErr w:type="spellEnd"/>
+      <w:r>
+        <w:rPr>
+          <w:sz w:val="28"/>
+          <w:szCs w:val="28"/>
+        </w:rPr>
+        <w:t>(), these concepts represent distinct steps in your data-handling workflow. [</w:t>
+      </w:r>
+      <w:hyperlink r:id="rId167" w:history="1">
+        <w:r>
+          <w:rPr>
+            <w:rStyle w:val="Hyperlink"/>
+            <w:sz w:val="28"/>
+            <w:szCs w:val="28"/>
+          </w:rPr>
+          <w:t>1</w:t>
+        </w:r>
+      </w:hyperlink>
+      <w:r>
+        <w:rPr>
+          <w:sz w:val="28"/>
+          <w:szCs w:val="28"/>
+        </w:rPr>
+        <w:t xml:space="preserve">, </w:t>
+      </w:r>
+      <w:hyperlink r:id="rId168" w:history="1">
+        <w:r>
+          <w:rPr>
+            <w:rStyle w:val="Hyperlink"/>
+            <w:sz w:val="28"/>
+            <w:szCs w:val="28"/>
+          </w:rPr>
+          <w:t>2</w:t>
+        </w:r>
+      </w:hyperlink>
+      <w:r>
+        <w:rPr>
+          <w:sz w:val="28"/>
+          <w:szCs w:val="28"/>
+        </w:rPr>
+        <w:t xml:space="preserve">, </w:t>
+      </w:r>
+      <w:hyperlink r:id="rId169" w:history="1">
+        <w:r>
+          <w:rPr>
+            <w:rStyle w:val="Hyperlink"/>
+            <w:sz w:val="28"/>
+            <w:szCs w:val="28"/>
+          </w:rPr>
+          <w:t>3</w:t>
+        </w:r>
+      </w:hyperlink>
+      <w:r>
+        <w:rPr>
+          <w:sz w:val="28"/>
+          <w:szCs w:val="28"/>
+        </w:rPr>
+        <w:t>]</w:t>
+      </w:r>
+    </w:p>
+    <w:p>
+      <w:pPr>
+        <w:rPr>
+          <w:b/>
+          <w:bCs/>
+          <w:sz w:val="28"/>
+          <w:szCs w:val="28"/>
+        </w:rPr>
+      </w:pPr>
+      <w:r>
+        <w:rPr>
+          <w:b/>
+          <w:bCs/>
+          <w:sz w:val="28"/>
+          <w:szCs w:val="28"/>
+        </w:rPr>
+        <w:t>1. Encoding (String → Binary)</w:t>
+      </w:r>
+    </w:p>
+    <w:p>
+      <w:pPr>
+        <w:numPr>
+          <w:ilvl w:val="0"/>
+          <w:numId w:val="30"/>
+        </w:numPr>
+        <w:rPr>
+          <w:sz w:val="28"/>
+          <w:szCs w:val="28"/>
+        </w:rPr>
+      </w:pPr>
+      <w:r>
+        <w:rPr>
+          <w:b/>
+          <w:bCs/>
+          <w:sz w:val="28"/>
+          <w:szCs w:val="28"/>
+        </w:rPr>
+        <w:t>What it is:</w:t>
+      </w:r>
+      <w:r>
+        <w:rPr>
+          <w:sz w:val="28"/>
+          <w:szCs w:val="28"/>
+        </w:rPr>
+        <w:t xml:space="preserve"> The process of translating readable characters (like UTF-8 text) into the raw binary data (bytes) that computers understand.</w:t>
+      </w:r>
+    </w:p>
+    <w:p>
+      <w:pPr>
+        <w:numPr>
+          <w:ilvl w:val="0"/>
+          <w:numId w:val="30"/>
+        </w:numPr>
+        <w:rPr>
+          <w:sz w:val="28"/>
+          <w:szCs w:val="28"/>
+        </w:rPr>
+      </w:pPr>
+      <w:r>
+        <w:rPr>
+          <w:b/>
+          <w:bCs/>
+          <w:sz w:val="28"/>
+          <w:szCs w:val="28"/>
+        </w:rPr>
+        <w:t xml:space="preserve">In </w:t>
+      </w:r>
+      <w:proofErr w:type="spellStart"/>
+      <w:r>
+        <w:rPr>
+          <w:b/>
+          <w:bCs/>
+          <w:sz w:val="28"/>
+          <w:szCs w:val="28"/>
+        </w:rPr>
+        <w:t>Buffer.from</w:t>
+      </w:r>
+      <w:proofErr w:type="spellEnd"/>
+      <w:r>
+        <w:rPr>
+          <w:b/>
+          <w:bCs/>
+          <w:sz w:val="28"/>
+          <w:szCs w:val="28"/>
+        </w:rPr>
+        <w:t>():</w:t>
+      </w:r>
+      <w:r>
+        <w:rPr>
+          <w:sz w:val="28"/>
+          <w:szCs w:val="28"/>
+        </w:rPr>
+        <w:t xml:space="preserve"> This is the primary function of </w:t>
+      </w:r>
+      <w:proofErr w:type="spellStart"/>
+      <w:r>
+        <w:rPr>
+          <w:sz w:val="28"/>
+          <w:szCs w:val="28"/>
+        </w:rPr>
+        <w:t>Buffer.from</w:t>
+      </w:r>
+      <w:proofErr w:type="spellEnd"/>
+      <w:r>
+        <w:rPr>
+          <w:sz w:val="28"/>
+          <w:szCs w:val="28"/>
+        </w:rPr>
+        <w:t>(string, 'encoding').</w:t>
+      </w:r>
+    </w:p>
+    <w:p>
+      <w:pPr>
+        <w:numPr>
+          <w:ilvl w:val="0"/>
+          <w:numId w:val="30"/>
+        </w:numPr>
+        <w:rPr>
+          <w:sz w:val="28"/>
+          <w:szCs w:val="28"/>
+        </w:rPr>
+      </w:pPr>
+      <w:r>
+        <w:rPr>
+          <w:b/>
+          <w:bCs/>
+          <w:sz w:val="28"/>
+          <w:szCs w:val="28"/>
+        </w:rPr>
+        <w:t>Example:</w:t>
+      </w:r>
+      <w:r>
+        <w:rPr>
+          <w:sz w:val="28"/>
+          <w:szCs w:val="28"/>
+        </w:rPr>
+        <w:t xml:space="preserve"> [</w:t>
+      </w:r>
+      <w:hyperlink r:id="rId170" w:history="1">
+        <w:r>
+          <w:rPr>
+            <w:rStyle w:val="Hyperlink"/>
+            <w:sz w:val="28"/>
+            <w:szCs w:val="28"/>
+          </w:rPr>
+          <w:t>1</w:t>
+        </w:r>
+      </w:hyperlink>
+      <w:r>
+        <w:rPr>
+          <w:sz w:val="28"/>
+          <w:szCs w:val="28"/>
+        </w:rPr>
+        <w:t xml:space="preserve">, </w:t>
+      </w:r>
+      <w:hyperlink r:id="rId171" w:history="1">
+        <w:r>
+          <w:rPr>
+            <w:rStyle w:val="Hyperlink"/>
+            <w:sz w:val="28"/>
+            <w:szCs w:val="28"/>
+          </w:rPr>
+          <w:t>2</w:t>
+        </w:r>
+      </w:hyperlink>
+      <w:r>
+        <w:rPr>
+          <w:sz w:val="28"/>
+          <w:szCs w:val="28"/>
+        </w:rPr>
+        <w:t xml:space="preserve">, </w:t>
+      </w:r>
+      <w:hyperlink r:id="rId172" w:history="1">
+        <w:r>
+          <w:rPr>
+            <w:rStyle w:val="Hyperlink"/>
+            <w:sz w:val="28"/>
+            <w:szCs w:val="28"/>
+          </w:rPr>
+          <w:t>3</w:t>
+        </w:r>
+      </w:hyperlink>
+      <w:r>
+        <w:rPr>
+          <w:sz w:val="28"/>
+          <w:szCs w:val="28"/>
+        </w:rPr>
+        <w:t xml:space="preserve">, </w:t>
+      </w:r>
+      <w:hyperlink r:id="rId173" w:history="1">
+        <w:r>
+          <w:rPr>
+            <w:rStyle w:val="Hyperlink"/>
+            <w:sz w:val="28"/>
+            <w:szCs w:val="28"/>
+          </w:rPr>
+          <w:t>4</w:t>
+        </w:r>
+      </w:hyperlink>
+      <w:r>
+        <w:rPr>
+          <w:sz w:val="28"/>
+          <w:szCs w:val="28"/>
+        </w:rPr>
+        <w:t>]</w:t>
+      </w:r>
+    </w:p>
+    <w:p>
+      <w:pPr>
+        <w:rPr>
+          <w:sz w:val="28"/>
+          <w:szCs w:val="28"/>
+        </w:rPr>
+      </w:pPr>
+      <w:proofErr w:type="spellStart"/>
+      <w:r>
+        <w:rPr>
+          <w:sz w:val="28"/>
+          <w:szCs w:val="28"/>
+        </w:rPr>
+        <w:t>javascript</w:t>
+      </w:r>
+      <w:proofErr w:type="spellEnd"/>
+    </w:p>
+    <w:p>
+      <w:pPr>
+        <w:rPr>
+          <w:sz w:val="28"/>
+          <w:szCs w:val="28"/>
+        </w:rPr>
+      </w:pPr>
+      <w:r>
+        <w:rPr>
+          <w:sz w:val="28"/>
+          <w:szCs w:val="28"/>
+        </w:rPr>
+        <w:t>// Encodes the string into raw binary bytes using UTF-8</w:t>
+      </w:r>
+    </w:p>
+    <w:p>
+      <w:pPr>
+        <w:rPr>
+          <w:sz w:val="28"/>
+          <w:szCs w:val="28"/>
+        </w:rPr>
+      </w:pPr>
+      <w:r>
+        <w:rPr>
+          <w:sz w:val="28"/>
+          <w:szCs w:val="28"/>
+        </w:rPr>
+        <w:t xml:space="preserve">const </w:t>
+      </w:r>
+      <w:proofErr w:type="spellStart"/>
+      <w:r>
+        <w:rPr>
+          <w:sz w:val="28"/>
+          <w:szCs w:val="28"/>
+        </w:rPr>
+        <w:t>buf</w:t>
+      </w:r>
+      <w:proofErr w:type="spellEnd"/>
+      <w:r>
+        <w:rPr>
+          <w:sz w:val="28"/>
+          <w:szCs w:val="28"/>
+        </w:rPr>
+        <w:t xml:space="preserve"> = </w:t>
+      </w:r>
+      <w:proofErr w:type="spellStart"/>
+      <w:r>
+        <w:rPr>
+          <w:sz w:val="28"/>
+          <w:szCs w:val="28"/>
+        </w:rPr>
+        <w:t>Buffer.from</w:t>
+      </w:r>
+      <w:proofErr w:type="spellEnd"/>
+      <w:r>
+        <w:rPr>
+          <w:sz w:val="28"/>
+          <w:szCs w:val="28"/>
+        </w:rPr>
+        <w:t xml:space="preserve">("hello", "utf-8"); </w:t>
+      </w:r>
+    </w:p>
+    <w:p>
+      <w:pPr>
+        <w:rPr>
+          <w:sz w:val="28"/>
+          <w:szCs w:val="28"/>
+        </w:rPr>
+      </w:pPr>
+      <w:r>
+        <w:rPr>
+          <w:sz w:val="28"/>
+          <w:szCs w:val="28"/>
+        </w:rPr>
+        <w:t>console.log(</w:t>
+      </w:r>
+      <w:proofErr w:type="spellStart"/>
+      <w:r>
+        <w:rPr>
+          <w:sz w:val="28"/>
+          <w:szCs w:val="28"/>
+        </w:rPr>
+        <w:t>buf</w:t>
+      </w:r>
+      <w:proofErr w:type="spellEnd"/>
+      <w:r>
+        <w:rPr>
+          <w:sz w:val="28"/>
+          <w:szCs w:val="28"/>
+        </w:rPr>
+        <w:t xml:space="preserve">); </w:t>
+      </w:r>
+    </w:p>
+    <w:p>
+      <w:pPr>
+        <w:rPr>
+          <w:sz w:val="28"/>
+          <w:szCs w:val="28"/>
+        </w:rPr>
+      </w:pPr>
+      <w:r>
+        <w:rPr>
+          <w:sz w:val="28"/>
+          <w:szCs w:val="28"/>
+        </w:rPr>
+        <w:t xml:space="preserve">// Output: &lt;Buffer 68 65 6c </w:t>
+      </w:r>
+      <w:proofErr w:type="spellStart"/>
+      <w:r>
+        <w:rPr>
+          <w:sz w:val="28"/>
+          <w:szCs w:val="28"/>
+        </w:rPr>
+        <w:t>6c</w:t>
+      </w:r>
+      <w:proofErr w:type="spellEnd"/>
+      <w:r>
+        <w:rPr>
+          <w:sz w:val="28"/>
+          <w:szCs w:val="28"/>
+        </w:rPr>
+        <w:t xml:space="preserve"> 6f&gt; (hex values for the characters)</w:t>
+      </w:r>
+    </w:p>
+    <w:p>
+      <w:pPr>
+        <w:rPr>
+          <w:sz w:val="28"/>
+          <w:szCs w:val="28"/>
+        </w:rPr>
+      </w:pPr>
+      <w:r>
+        <w:rPr>
+          <w:sz w:val="28"/>
+          <w:szCs w:val="28"/>
+        </w:rPr>
+        <w:t>Use code with caution.</w:t>
+      </w:r>
+    </w:p>
+    <w:p>
+      <w:pPr>
+        <w:rPr>
+          <w:b/>
+          <w:bCs/>
+          <w:sz w:val="28"/>
+          <w:szCs w:val="28"/>
+        </w:rPr>
+      </w:pPr>
+      <w:r>
+        <w:rPr>
+          <w:b/>
+          <w:bCs/>
+          <w:sz w:val="28"/>
+          <w:szCs w:val="28"/>
+        </w:rPr>
+        <w:t>2. Decoding (Binary → String)</w:t>
+      </w:r>
+    </w:p>
+    <w:p>
+      <w:pPr>
+        <w:numPr>
+          <w:ilvl w:val="0"/>
+          <w:numId w:val="31"/>
+        </w:numPr>
+        <w:rPr>
+          <w:sz w:val="28"/>
+          <w:szCs w:val="28"/>
+        </w:rPr>
+      </w:pPr>
+      <w:r>
+        <w:rPr>
+          <w:b/>
+          <w:bCs/>
+          <w:sz w:val="28"/>
+          <w:szCs w:val="28"/>
+        </w:rPr>
+        <w:t>What it is:</w:t>
+      </w:r>
+      <w:r>
+        <w:rPr>
+          <w:sz w:val="28"/>
+          <w:szCs w:val="28"/>
+        </w:rPr>
+        <w:t xml:space="preserve"> The reverse of encoding. It translates raw binary bytes back into a readable human format.</w:t>
+      </w:r>
+    </w:p>
+    <w:p>
+      <w:pPr>
+        <w:numPr>
+          <w:ilvl w:val="0"/>
+          <w:numId w:val="31"/>
+        </w:numPr>
+        <w:rPr>
+          <w:sz w:val="28"/>
+          <w:szCs w:val="28"/>
+        </w:rPr>
+      </w:pPr>
+      <w:r>
+        <w:rPr>
+          <w:b/>
+          <w:bCs/>
+          <w:sz w:val="28"/>
+          <w:szCs w:val="28"/>
+        </w:rPr>
+        <w:lastRenderedPageBreak/>
+        <w:t xml:space="preserve">In </w:t>
+      </w:r>
+      <w:proofErr w:type="spellStart"/>
+      <w:r>
+        <w:rPr>
+          <w:b/>
+          <w:bCs/>
+          <w:sz w:val="28"/>
+          <w:szCs w:val="28"/>
+        </w:rPr>
+        <w:t>Buffer.from</w:t>
+      </w:r>
+      <w:proofErr w:type="spellEnd"/>
+      <w:r>
+        <w:rPr>
+          <w:b/>
+          <w:bCs/>
+          <w:sz w:val="28"/>
+          <w:szCs w:val="28"/>
+        </w:rPr>
+        <w:t>():</w:t>
+      </w:r>
+      <w:r>
+        <w:rPr>
+          <w:sz w:val="28"/>
+          <w:szCs w:val="28"/>
+        </w:rPr>
+        <w:t xml:space="preserve"> You decode a buffer by parsing raw bytes </w:t>
+      </w:r>
+      <w:proofErr w:type="gramStart"/>
+      <w:r>
+        <w:rPr>
+          <w:sz w:val="28"/>
+          <w:szCs w:val="28"/>
+        </w:rPr>
+        <w:t>via .</w:t>
+      </w:r>
+      <w:proofErr w:type="spellStart"/>
+      <w:r>
+        <w:rPr>
+          <w:sz w:val="28"/>
+          <w:szCs w:val="28"/>
+        </w:rPr>
+        <w:t>toString</w:t>
+      </w:r>
+      <w:proofErr w:type="spellEnd"/>
+      <w:proofErr w:type="gramEnd"/>
+      <w:r>
+        <w:rPr>
+          <w:sz w:val="28"/>
+          <w:szCs w:val="28"/>
+        </w:rPr>
+        <w:t>('encoding').</w:t>
+      </w:r>
+    </w:p>
+    <w:p>
+      <w:pPr>
+        <w:numPr>
+          <w:ilvl w:val="0"/>
+          <w:numId w:val="31"/>
+        </w:numPr>
+        <w:rPr>
+          <w:sz w:val="28"/>
+          <w:szCs w:val="28"/>
+        </w:rPr>
+      </w:pPr>
+      <w:r>
+        <w:rPr>
+          <w:b/>
+          <w:bCs/>
+          <w:sz w:val="28"/>
+          <w:szCs w:val="28"/>
+        </w:rPr>
+        <w:t>Example:</w:t>
+      </w:r>
+      <w:r>
+        <w:rPr>
+          <w:sz w:val="28"/>
+          <w:szCs w:val="28"/>
+        </w:rPr>
+        <w:t xml:space="preserve"> [</w:t>
+      </w:r>
+      <w:hyperlink r:id="rId174" w:history="1">
+        <w:r>
+          <w:rPr>
+            <w:rStyle w:val="Hyperlink"/>
+            <w:sz w:val="28"/>
+            <w:szCs w:val="28"/>
+          </w:rPr>
+          <w:t>1</w:t>
+        </w:r>
+      </w:hyperlink>
+      <w:r>
+        <w:rPr>
+          <w:sz w:val="28"/>
+          <w:szCs w:val="28"/>
+        </w:rPr>
+        <w:t xml:space="preserve">, </w:t>
+      </w:r>
+      <w:hyperlink r:id="rId175" w:history="1">
+        <w:r>
+          <w:rPr>
+            <w:rStyle w:val="Hyperlink"/>
+            <w:sz w:val="28"/>
+            <w:szCs w:val="28"/>
+          </w:rPr>
+          <w:t>2</w:t>
+        </w:r>
+      </w:hyperlink>
+      <w:r>
+        <w:rPr>
+          <w:sz w:val="28"/>
+          <w:szCs w:val="28"/>
+        </w:rPr>
+        <w:t xml:space="preserve">, </w:t>
+      </w:r>
+      <w:hyperlink r:id="rId176" w:history="1">
+        <w:r>
+          <w:rPr>
+            <w:rStyle w:val="Hyperlink"/>
+            <w:sz w:val="28"/>
+            <w:szCs w:val="28"/>
+          </w:rPr>
+          <w:t>3</w:t>
+        </w:r>
+      </w:hyperlink>
+      <w:r>
+        <w:rPr>
+          <w:sz w:val="28"/>
+          <w:szCs w:val="28"/>
+        </w:rPr>
+        <w:t xml:space="preserve">, </w:t>
+      </w:r>
+      <w:hyperlink r:id="rId177" w:history="1">
+        <w:r>
+          <w:rPr>
+            <w:rStyle w:val="Hyperlink"/>
+            <w:sz w:val="28"/>
+            <w:szCs w:val="28"/>
+          </w:rPr>
+          <w:t>4</w:t>
+        </w:r>
+      </w:hyperlink>
+      <w:r>
+        <w:rPr>
+          <w:sz w:val="28"/>
+          <w:szCs w:val="28"/>
+        </w:rPr>
+        <w:t xml:space="preserve">, </w:t>
+      </w:r>
+      <w:hyperlink r:id="rId178" w:history="1">
+        <w:r>
+          <w:rPr>
+            <w:rStyle w:val="Hyperlink"/>
+            <w:sz w:val="28"/>
+            <w:szCs w:val="28"/>
+          </w:rPr>
+          <w:t>5</w:t>
+        </w:r>
+      </w:hyperlink>
+      <w:r>
+        <w:rPr>
+          <w:sz w:val="28"/>
+          <w:szCs w:val="28"/>
+        </w:rPr>
+        <w:t>]</w:t>
+      </w:r>
+    </w:p>
+    <w:p>
+      <w:pPr>
+        <w:rPr>
+          <w:sz w:val="28"/>
+          <w:szCs w:val="28"/>
+        </w:rPr>
+      </w:pPr>
+      <w:proofErr w:type="spellStart"/>
+      <w:r>
+        <w:rPr>
+          <w:sz w:val="28"/>
+          <w:szCs w:val="28"/>
+        </w:rPr>
+        <w:t>javascript</w:t>
+      </w:r>
+      <w:proofErr w:type="spellEnd"/>
+    </w:p>
+    <w:p>
+      <w:pPr>
+        <w:rPr>
+          <w:sz w:val="28"/>
+          <w:szCs w:val="28"/>
+        </w:rPr>
+      </w:pPr>
+      <w:r>
+        <w:rPr>
+          <w:sz w:val="28"/>
+          <w:szCs w:val="28"/>
+        </w:rPr>
+        <w:t>// Decodes a pre-existing buffer into a UTF-8 readable string</w:t>
+      </w:r>
+    </w:p>
+    <w:p>
+      <w:pPr>
+        <w:rPr>
+          <w:sz w:val="28"/>
+          <w:szCs w:val="28"/>
+        </w:rPr>
+      </w:pPr>
+      <w:r>
+        <w:rPr>
+          <w:sz w:val="28"/>
+          <w:szCs w:val="28"/>
+        </w:rPr>
+        <w:t xml:space="preserve">const text = </w:t>
+      </w:r>
+      <w:proofErr w:type="spellStart"/>
+      <w:proofErr w:type="gramStart"/>
+      <w:r>
+        <w:rPr>
+          <w:sz w:val="28"/>
+          <w:szCs w:val="28"/>
+        </w:rPr>
+        <w:t>buf.toString</w:t>
+      </w:r>
+      <w:proofErr w:type="spellEnd"/>
+      <w:proofErr w:type="gramEnd"/>
+      <w:r>
+        <w:rPr>
+          <w:sz w:val="28"/>
+          <w:szCs w:val="28"/>
+        </w:rPr>
+        <w:t>("utf-8");</w:t>
+      </w:r>
+    </w:p>
+    <w:p>
+      <w:pPr>
+        <w:rPr>
+          <w:sz w:val="28"/>
+          <w:szCs w:val="28"/>
+        </w:rPr>
+      </w:pPr>
+      <w:r>
+        <w:rPr>
+          <w:sz w:val="28"/>
+          <w:szCs w:val="28"/>
+        </w:rPr>
+        <w:t xml:space="preserve">console.log(text); </w:t>
+      </w:r>
+    </w:p>
+    <w:p>
+      <w:pPr>
+        <w:rPr>
+          <w:sz w:val="28"/>
+          <w:szCs w:val="28"/>
+        </w:rPr>
+      </w:pPr>
+      <w:r>
+        <w:rPr>
+          <w:sz w:val="28"/>
+          <w:szCs w:val="28"/>
+        </w:rPr>
+        <w:t>// Output: "hello"</w:t>
+      </w:r>
+    </w:p>
+    <w:p>
+      <w:pPr>
+        <w:rPr>
+          <w:sz w:val="28"/>
+          <w:szCs w:val="28"/>
+        </w:rPr>
+      </w:pPr>
+      <w:r>
+        <w:rPr>
+          <w:sz w:val="28"/>
+          <w:szCs w:val="28"/>
+        </w:rPr>
+        <w:t>Use code with caution.</w:t>
+      </w:r>
+    </w:p>
+    <w:p>
+      <w:pPr>
+        <w:rPr>
+          <w:b/>
+          <w:bCs/>
+          <w:sz w:val="28"/>
+          <w:szCs w:val="28"/>
+        </w:rPr>
+      </w:pPr>
+      <w:r>
+        <w:rPr>
+          <w:b/>
+          <w:bCs/>
+          <w:sz w:val="28"/>
+          <w:szCs w:val="28"/>
+        </w:rPr>
+        <w:t>3. Conversion (Binary → Binary)</w:t>
+      </w:r>
+    </w:p>
+    <w:p>
+      <w:pPr>
+        <w:numPr>
+          <w:ilvl w:val="0"/>
+          <w:numId w:val="32"/>
+        </w:numPr>
+        <w:rPr>
+          <w:sz w:val="28"/>
+          <w:szCs w:val="28"/>
+        </w:rPr>
+      </w:pPr>
+      <w:r>
+        <w:rPr>
+          <w:b/>
+          <w:bCs/>
+          <w:sz w:val="28"/>
+          <w:szCs w:val="28"/>
+        </w:rPr>
+        <w:t>What it is:</w:t>
+      </w:r>
+      <w:r>
+        <w:rPr>
+          <w:sz w:val="28"/>
+          <w:szCs w:val="28"/>
+        </w:rPr>
+        <w:t xml:space="preserve"> The process of taking raw bytes in one binary format (like Base64 or Hex) and translating them into entirely different raw bytes. The data remains in a Buffer object throughout.</w:t>
+      </w:r>
+    </w:p>
+    <w:p>
+      <w:pPr>
+        <w:numPr>
+          <w:ilvl w:val="0"/>
+          <w:numId w:val="32"/>
+        </w:numPr>
+        <w:rPr>
+          <w:sz w:val="28"/>
+          <w:szCs w:val="28"/>
+        </w:rPr>
+      </w:pPr>
+      <w:r>
+        <w:rPr>
+          <w:b/>
+          <w:bCs/>
+          <w:sz w:val="28"/>
+          <w:szCs w:val="28"/>
+        </w:rPr>
+        <w:t xml:space="preserve">In </w:t>
+      </w:r>
+      <w:proofErr w:type="spellStart"/>
+      <w:r>
+        <w:rPr>
+          <w:b/>
+          <w:bCs/>
+          <w:sz w:val="28"/>
+          <w:szCs w:val="28"/>
+        </w:rPr>
+        <w:t>Buffer.from</w:t>
+      </w:r>
+      <w:proofErr w:type="spellEnd"/>
+      <w:r>
+        <w:rPr>
+          <w:b/>
+          <w:bCs/>
+          <w:sz w:val="28"/>
+          <w:szCs w:val="28"/>
+        </w:rPr>
+        <w:t>():</w:t>
+      </w:r>
+      <w:r>
+        <w:rPr>
+          <w:sz w:val="28"/>
+          <w:szCs w:val="28"/>
+        </w:rPr>
+        <w:t xml:space="preserve"> This is achieved by combining </w:t>
+      </w:r>
+      <w:proofErr w:type="spellStart"/>
+      <w:r>
+        <w:rPr>
+          <w:sz w:val="28"/>
+          <w:szCs w:val="28"/>
+        </w:rPr>
+        <w:t>Buffer.from</w:t>
+      </w:r>
+      <w:proofErr w:type="spellEnd"/>
+      <w:r>
+        <w:rPr>
+          <w:sz w:val="28"/>
+          <w:szCs w:val="28"/>
+        </w:rPr>
+        <w:t>(data, '</w:t>
+      </w:r>
+      <w:proofErr w:type="spellStart"/>
+      <w:r>
+        <w:rPr>
+          <w:sz w:val="28"/>
+          <w:szCs w:val="28"/>
+        </w:rPr>
+        <w:t>source_encoding</w:t>
+      </w:r>
+      <w:proofErr w:type="spellEnd"/>
+      <w:r>
+        <w:rPr>
+          <w:sz w:val="28"/>
+          <w:szCs w:val="28"/>
+        </w:rPr>
+        <w:t xml:space="preserve">') </w:t>
+      </w:r>
+      <w:proofErr w:type="gramStart"/>
+      <w:r>
+        <w:rPr>
+          <w:sz w:val="28"/>
+          <w:szCs w:val="28"/>
+        </w:rPr>
+        <w:t>with .</w:t>
+      </w:r>
+      <w:proofErr w:type="spellStart"/>
+      <w:r>
+        <w:rPr>
+          <w:sz w:val="28"/>
+          <w:szCs w:val="28"/>
+        </w:rPr>
+        <w:t>toString</w:t>
+      </w:r>
+      <w:proofErr w:type="spellEnd"/>
+      <w:proofErr w:type="gramEnd"/>
+      <w:r>
+        <w:rPr>
+          <w:sz w:val="28"/>
+          <w:szCs w:val="28"/>
+        </w:rPr>
+        <w:t>('</w:t>
+      </w:r>
+      <w:proofErr w:type="spellStart"/>
+      <w:r>
+        <w:rPr>
+          <w:sz w:val="28"/>
+          <w:szCs w:val="28"/>
+        </w:rPr>
+        <w:t>target_encoding</w:t>
+      </w:r>
+      <w:proofErr w:type="spellEnd"/>
+      <w:r>
+        <w:rPr>
+          <w:sz w:val="28"/>
+          <w:szCs w:val="28"/>
+        </w:rPr>
+        <w:t>').</w:t>
+      </w:r>
+    </w:p>
+    <w:p>
+      <w:pPr>
+        <w:numPr>
+          <w:ilvl w:val="0"/>
+          <w:numId w:val="32"/>
+        </w:numPr>
+        <w:rPr>
+          <w:sz w:val="28"/>
+          <w:szCs w:val="28"/>
+        </w:rPr>
+      </w:pPr>
+      <w:r>
+        <w:rPr>
+          <w:b/>
+          <w:bCs/>
+          <w:sz w:val="28"/>
+          <w:szCs w:val="28"/>
+        </w:rPr>
+        <w:t>Example:</w:t>
+      </w:r>
+      <w:r>
+        <w:rPr>
+          <w:sz w:val="28"/>
+          <w:szCs w:val="28"/>
+        </w:rPr>
+        <w:t xml:space="preserve"> [</w:t>
+      </w:r>
+      <w:hyperlink r:id="rId179" w:history="1">
+        <w:r>
+          <w:rPr>
+            <w:rStyle w:val="Hyperlink"/>
+            <w:sz w:val="28"/>
+            <w:szCs w:val="28"/>
+          </w:rPr>
+          <w:t>1</w:t>
+        </w:r>
+      </w:hyperlink>
+      <w:r>
+        <w:rPr>
+          <w:sz w:val="28"/>
+          <w:szCs w:val="28"/>
+        </w:rPr>
+        <w:t xml:space="preserve">, </w:t>
+      </w:r>
+      <w:hyperlink r:id="rId180" w:history="1">
+        <w:r>
+          <w:rPr>
+            <w:rStyle w:val="Hyperlink"/>
+            <w:sz w:val="28"/>
+            <w:szCs w:val="28"/>
+          </w:rPr>
+          <w:t>2</w:t>
+        </w:r>
+      </w:hyperlink>
+      <w:r>
+        <w:rPr>
+          <w:sz w:val="28"/>
+          <w:szCs w:val="28"/>
+        </w:rPr>
+        <w:t xml:space="preserve">, </w:t>
+      </w:r>
+      <w:hyperlink r:id="rId181" w:history="1">
+        <w:r>
+          <w:rPr>
+            <w:rStyle w:val="Hyperlink"/>
+            <w:sz w:val="28"/>
+            <w:szCs w:val="28"/>
+          </w:rPr>
+          <w:t>3</w:t>
+        </w:r>
+      </w:hyperlink>
+      <w:r>
+        <w:rPr>
+          <w:sz w:val="28"/>
+          <w:szCs w:val="28"/>
+        </w:rPr>
+        <w:t>]</w:t>
+      </w:r>
+    </w:p>
+    <w:p>
+      <w:pPr>
+        <w:rPr>
+          <w:sz w:val="28"/>
+          <w:szCs w:val="28"/>
+        </w:rPr>
+      </w:pPr>
+      <w:proofErr w:type="spellStart"/>
+      <w:r>
+        <w:rPr>
+          <w:sz w:val="28"/>
+          <w:szCs w:val="28"/>
+        </w:rPr>
+        <w:t>javascript</w:t>
+      </w:r>
+      <w:proofErr w:type="spellEnd"/>
+    </w:p>
+    <w:p>
+      <w:pPr>
+        <w:rPr>
+          <w:sz w:val="28"/>
+          <w:szCs w:val="28"/>
+        </w:rPr>
+      </w:pPr>
+      <w:r>
+        <w:rPr>
+          <w:sz w:val="28"/>
+          <w:szCs w:val="28"/>
+        </w:rPr>
+        <w:t>// Converts a UTF-8 string into a Base64 binary string</w:t>
+      </w:r>
+    </w:p>
+    <w:p>
+      <w:pPr>
+        <w:rPr>
+          <w:sz w:val="28"/>
+          <w:szCs w:val="28"/>
+        </w:rPr>
+      </w:pPr>
+      <w:r>
+        <w:rPr>
+          <w:sz w:val="28"/>
+          <w:szCs w:val="28"/>
+        </w:rPr>
+        <w:t xml:space="preserve">const base64Str = </w:t>
+      </w:r>
+      <w:proofErr w:type="spellStart"/>
+      <w:r>
+        <w:rPr>
+          <w:sz w:val="28"/>
+          <w:szCs w:val="28"/>
+        </w:rPr>
+        <w:t>Buffer.from</w:t>
+      </w:r>
+      <w:proofErr w:type="spellEnd"/>
+      <w:r>
+        <w:rPr>
+          <w:sz w:val="28"/>
+          <w:szCs w:val="28"/>
+        </w:rPr>
+        <w:t>("hello", "utf-8"</w:t>
+      </w:r>
+      <w:proofErr w:type="gramStart"/>
+      <w:r>
+        <w:rPr>
+          <w:sz w:val="28"/>
+          <w:szCs w:val="28"/>
+        </w:rPr>
+        <w:t>).</w:t>
+      </w:r>
+      <w:proofErr w:type="spellStart"/>
+      <w:r>
+        <w:rPr>
+          <w:sz w:val="28"/>
+          <w:szCs w:val="28"/>
+        </w:rPr>
+        <w:t>toString</w:t>
+      </w:r>
+      <w:proofErr w:type="spellEnd"/>
+      <w:proofErr w:type="gramEnd"/>
+      <w:r>
+        <w:rPr>
+          <w:sz w:val="28"/>
+          <w:szCs w:val="28"/>
+        </w:rPr>
+        <w:t>("base64");</w:t>
+      </w:r>
+    </w:p>
+    <w:p>
+      <w:pPr>
+        <w:rPr>
+          <w:sz w:val="28"/>
+          <w:szCs w:val="28"/>
+        </w:rPr>
+      </w:pPr>
+      <w:r>
+        <w:rPr>
+          <w:sz w:val="28"/>
+          <w:szCs w:val="28"/>
+        </w:rPr>
+        <w:t xml:space="preserve">console.log(base64Str); </w:t>
+      </w:r>
+    </w:p>
+    <w:p>
+      <w:pPr>
+        <w:rPr>
+          <w:sz w:val="28"/>
+          <w:szCs w:val="28"/>
+        </w:rPr>
+      </w:pPr>
+      <w:r>
+        <w:rPr>
+          <w:sz w:val="28"/>
+          <w:szCs w:val="28"/>
+        </w:rPr>
+        <w:t>// Output: "aGVsbG8="</w:t>
+      </w:r>
+    </w:p>
+    <w:p>
+      <w:pPr>
+        <w:rPr>
+          <w:sz w:val="28"/>
+          <w:szCs w:val="28"/>
+        </w:rPr>
+      </w:pPr>
+    </w:p>
+    <w:p>
+      <w:pPr>
+        <w:rPr>
+          <w:sz w:val="28"/>
+          <w:szCs w:val="28"/>
+        </w:rPr>
+      </w:pPr>
+      <w:r>
+        <w:rPr>
+          <w:sz w:val="28"/>
+          <w:szCs w:val="28"/>
+        </w:rPr>
+        <w:t>// Converts Base64 raw bytes back to a standard UTF-8 buffer</w:t>
+      </w:r>
+    </w:p>
+    <w:p>
+      <w:pPr>
+        <w:rPr>
+          <w:sz w:val="28"/>
+          <w:szCs w:val="28"/>
+        </w:rPr>
+      </w:pPr>
+      <w:r>
+        <w:rPr>
+          <w:sz w:val="28"/>
+          <w:szCs w:val="28"/>
+        </w:rPr>
+        <w:t xml:space="preserve">const </w:t>
+      </w:r>
+      <w:proofErr w:type="spellStart"/>
+      <w:r>
+        <w:rPr>
+          <w:sz w:val="28"/>
+          <w:szCs w:val="28"/>
+        </w:rPr>
+        <w:t>originalBuf</w:t>
+      </w:r>
+      <w:proofErr w:type="spellEnd"/>
+      <w:r>
+        <w:rPr>
+          <w:sz w:val="28"/>
+          <w:szCs w:val="28"/>
+        </w:rPr>
+        <w:t xml:space="preserve"> = </w:t>
+      </w:r>
+      <w:proofErr w:type="spellStart"/>
+      <w:r>
+        <w:rPr>
+          <w:sz w:val="28"/>
+          <w:szCs w:val="28"/>
+        </w:rPr>
+        <w:t>Buffer.from</w:t>
+      </w:r>
+      <w:proofErr w:type="spellEnd"/>
+      <w:r>
+        <w:rPr>
+          <w:sz w:val="28"/>
+          <w:szCs w:val="28"/>
+        </w:rPr>
+        <w:t>(base64Str, "base64");</w:t>
+      </w:r>
+    </w:p>
+    <w:p>
+      <w:pPr>
+        <w:rPr>
+          <w:sz w:val="28"/>
+          <w:szCs w:val="28"/>
+        </w:rPr>
+      </w:pPr>
+      <w:r>
+        <w:rPr>
+          <w:sz w:val="28"/>
+          <w:szCs w:val="28"/>
+        </w:rPr>
+        <w:lastRenderedPageBreak/>
+        <w:t>Use code with caution.</w:t>
+      </w:r>
+    </w:p>
+    <w:p>
+      <w:pPr>
+        <w:rPr>
+          <w:sz w:val="28"/>
+          <w:szCs w:val="28"/>
+        </w:rPr>
+      </w:pPr>
+      <w:r>
+        <w:rPr>
+          <w:sz w:val="28"/>
+          <w:szCs w:val="28"/>
+        </w:rPr>
+        <w:t xml:space="preserve">Are you trying to </w:t>
+      </w:r>
+      <w:r>
+        <w:rPr>
+          <w:b/>
+          <w:bCs/>
+          <w:sz w:val="28"/>
+          <w:szCs w:val="28"/>
+        </w:rPr>
+        <w:t>parse a specific file format</w:t>
+      </w:r>
+      <w:r>
+        <w:rPr>
+          <w:sz w:val="28"/>
+          <w:szCs w:val="28"/>
+        </w:rPr>
+        <w:t xml:space="preserve"> (like Base64 to UTF-8), or are you dealing with </w:t>
+      </w:r>
+      <w:r>
+        <w:rPr>
+          <w:b/>
+          <w:bCs/>
+          <w:sz w:val="28"/>
+          <w:szCs w:val="28"/>
+        </w:rPr>
+        <w:t>network data streams</w:t>
+      </w:r>
+      <w:r>
+        <w:rPr>
+          <w:sz w:val="28"/>
+          <w:szCs w:val="28"/>
+        </w:rPr>
+        <w:t xml:space="preserve">? If you share the exact </w:t>
+      </w:r>
+      <w:r>
+        <w:rPr>
+          <w:b/>
+          <w:bCs/>
+          <w:sz w:val="28"/>
+          <w:szCs w:val="28"/>
+        </w:rPr>
+        <w:t>data input</w:t>
+      </w:r>
+      <w:r>
+        <w:rPr>
+          <w:sz w:val="28"/>
+          <w:szCs w:val="28"/>
+        </w:rPr>
+        <w:t xml:space="preserve"> and the </w:t>
+      </w:r>
+      <w:r>
+        <w:rPr>
+          <w:b/>
+          <w:bCs/>
+          <w:sz w:val="28"/>
+          <w:szCs w:val="28"/>
+        </w:rPr>
+        <w:t>desired output</w:t>
+      </w:r>
+      <w:r>
+        <w:rPr>
+          <w:sz w:val="28"/>
+          <w:szCs w:val="28"/>
+        </w:rPr>
+        <w:t>, I can write the exact code you need.</w:t>
+      </w:r>
+    </w:p>
+    <w:p>
+      <w:pPr>
+        <w:rPr>
+          <w:sz w:val="28"/>
+          <w:szCs w:val="28"/>
+        </w:rPr>
+      </w:pPr>
+    </w:p>
+    <w:p/>
+    <w:p/>
     <w:p/>
     <w:sectPr>
       <w:pgSz w:w="12240" w:h="15840"/>
@@ -11970,6 +13443,155 @@
     </w:lvl>
   </w:abstractNum>
   <w:abstractNum w:abstractNumId="1" w15:restartNumberingAfterBreak="0">
+    <w:nsid w:val="042D6C6B"/>
+    <w:multiLevelType w:val="multilevel"/>
+    <w:tmpl w:val="22D6D256"/>
+    <w:lvl w:ilvl="0">
+      <w:start w:val="1"/>
+      <w:numFmt w:val="bullet"/>
+      <w:lvlText w:val=""/>
+      <w:lvlJc w:val="left"/>
+      <w:pPr>
+        <w:tabs>
+          <w:tab w:val="num" w:pos="720"/>
+        </w:tabs>
+        <w:ind w:left="720" w:hanging="360"/>
+      </w:pPr>
+      <w:rPr>
+        <w:rFonts w:ascii="Symbol" w:hAnsi="Symbol" w:hint="default"/>
+        <w:sz w:val="20"/>
+      </w:rPr>
+    </w:lvl>
+    <w:lvl w:ilvl="1" w:tentative="1">
+      <w:start w:val="1"/>
+      <w:numFmt w:val="bullet"/>
+      <w:lvlText w:val="o"/>
+      <w:lvlJc w:val="left"/>
+      <w:pPr>
+        <w:tabs>
+          <w:tab w:val="num" w:pos="1440"/>
+        </w:tabs>
+        <w:ind w:left="1440" w:hanging="360"/>
+      </w:pPr>
+      <w:rPr>
+        <w:rFonts w:ascii="Courier New" w:hAnsi="Courier New" w:hint="default"/>
+        <w:sz w:val="20"/>
+      </w:rPr>
+    </w:lvl>
+    <w:lvl w:ilvl="2" w:tentative="1">
+      <w:start w:val="1"/>
+      <w:numFmt w:val="bullet"/>
+      <w:lvlText w:val=""/>
+      <w:lvlJc w:val="left"/>
+      <w:pPr>
+        <w:tabs>
+          <w:tab w:val="num" w:pos="2160"/>
+        </w:tabs>
+        <w:ind w:left="2160" w:hanging="360"/>
+      </w:pPr>
+      <w:rPr>
+        <w:rFonts w:ascii="Wingdings" w:hAnsi="Wingdings" w:hint="default"/>
+        <w:sz w:val="20"/>
+      </w:rPr>
+    </w:lvl>
+    <w:lvl w:ilvl="3" w:tentative="1">
+      <w:start w:val="1"/>
+      <w:numFmt w:val="bullet"/>
+      <w:lvlText w:val=""/>
+      <w:lvlJc w:val="left"/>
+      <w:pPr>
+        <w:tabs>
+          <w:tab w:val="num" w:pos="2880"/>
+        </w:tabs>
+        <w:ind w:left="2880" w:hanging="360"/>
+      </w:pPr>
+      <w:rPr>
+        <w:rFonts w:ascii="Wingdings" w:hAnsi="Wingdings" w:hint="default"/>
+        <w:sz w:val="20"/>
+      </w:rPr>
+    </w:lvl>
+    <w:lvl w:ilvl="4" w:tentative="1">
+      <w:start w:val="1"/>
+      <w:numFmt w:val="bullet"/>
+      <w:lvlText w:val=""/>
+      <w:lvlJc w:val="left"/>
+      <w:pPr>
+        <w:tabs>
+          <w:tab w:val="num" w:pos="3600"/>
+        </w:tabs>
+        <w:ind w:left="3600" w:hanging="360"/>
+      </w:pPr>
+      <w:rPr>
+        <w:rFonts w:ascii="Wingdings" w:hAnsi="Wingdings" w:hint="default"/>
+        <w:sz w:val="20"/>
+      </w:rPr>
+    </w:lvl>
+    <w:lvl w:ilvl="5" w:tentative="1">
+      <w:start w:val="1"/>
+      <w:numFmt w:val="bullet"/>
+      <w:lvlText w:val=""/>
+      <w:lvlJc w:val="left"/>
+      <w:pPr>
+        <w:tabs>
+          <w:tab w:val="num" w:pos="4320"/>
+        </w:tabs>
+        <w:ind w:left="4320" w:hanging="360"/>
+      </w:pPr>
+      <w:rPr>
+        <w:rFonts w:ascii="Wingdings" w:hAnsi="Wingdings" w:hint="default"/>
+        <w:sz w:val="20"/>
+      </w:rPr>
+    </w:lvl>
+    <w:lvl w:ilvl="6" w:tentative="1">
+      <w:start w:val="1"/>
+      <w:numFmt w:val="bullet"/>
+      <w:lvlText w:val=""/>
+      <w:lvlJc w:val="left"/>
+      <w:pPr>
+        <w:tabs>
+          <w:tab w:val="num" w:pos="5040"/>
+        </w:tabs>
+        <w:ind w:left="5040" w:hanging="360"/>
+      </w:pPr>
+      <w:rPr>
+        <w:rFonts w:ascii="Wingdings" w:hAnsi="Wingdings" w:hint="default"/>
+        <w:sz w:val="20"/>
+      </w:rPr>
+    </w:lvl>
+    <w:lvl w:ilvl="7" w:tentative="1">
+      <w:start w:val="1"/>
+      <w:numFmt w:val="bullet"/>
+      <w:lvlText w:val=""/>
+      <w:lvlJc w:val="left"/>
+      <w:pPr>
+        <w:tabs>
+          <w:tab w:val="num" w:pos="5760"/>
+        </w:tabs>
+        <w:ind w:left="5760" w:hanging="360"/>
+      </w:pPr>
+      <w:rPr>
+        <w:rFonts w:ascii="Wingdings" w:hAnsi="Wingdings" w:hint="default"/>
+        <w:sz w:val="20"/>
+      </w:rPr>
+    </w:lvl>
+    <w:lvl w:ilvl="8" w:tentative="1">
+      <w:start w:val="1"/>
+      <w:numFmt w:val="bullet"/>
+      <w:lvlText w:val=""/>
+      <w:lvlJc w:val="left"/>
+      <w:pPr>
+        <w:tabs>
+          <w:tab w:val="num" w:pos="6480"/>
+        </w:tabs>
+        <w:ind w:left="6480" w:hanging="360"/>
+      </w:pPr>
+      <w:rPr>
+        <w:rFonts w:ascii="Wingdings" w:hAnsi="Wingdings" w:hint="default"/>
+        <w:sz w:val="20"/>
+      </w:rPr>
+    </w:lvl>
+  </w:abstractNum>
+  <w:abstractNum w:abstractNumId="2" w15:restartNumberingAfterBreak="0">
     <w:nsid w:val="064952D9"/>
     <w:multiLevelType w:val="multilevel"/>
     <w:tmpl w:val="3424BAF2"/>
@@ -12118,7 +13740,7 @@
       </w:rPr>
     </w:lvl>
   </w:abstractNum>
-  <w:abstractNum w:abstractNumId="2" w15:restartNumberingAfterBreak="0">
+  <w:abstractNum w:abstractNumId="3" w15:restartNumberingAfterBreak="0">
     <w:nsid w:val="06F93E36"/>
     <w:multiLevelType w:val="multilevel"/>
     <w:tmpl w:val="96D4B7D2"/>
@@ -12267,7 +13889,7 @@
       </w:rPr>
     </w:lvl>
   </w:abstractNum>
-  <w:abstractNum w:abstractNumId="3" w15:restartNumberingAfterBreak="0">
+  <w:abstractNum w:abstractNumId="4" w15:restartNumberingAfterBreak="0">
     <w:nsid w:val="07DC36E9"/>
     <w:multiLevelType w:val="multilevel"/>
     <w:tmpl w:val="979A62C0"/>
@@ -12416,7 +14038,7 @@
       </w:rPr>
     </w:lvl>
   </w:abstractNum>
-  <w:abstractNum w:abstractNumId="4" w15:restartNumberingAfterBreak="0">
+  <w:abstractNum w:abstractNumId="5" w15:restartNumberingAfterBreak="0">
     <w:nsid w:val="08EA2F90"/>
     <w:multiLevelType w:val="multilevel"/>
     <w:tmpl w:val="AB44F044"/>
@@ -12565,7 +14187,7 @@
       </w:rPr>
     </w:lvl>
   </w:abstractNum>
-  <w:abstractNum w:abstractNumId="5" w15:restartNumberingAfterBreak="0">
+  <w:abstractNum w:abstractNumId="6" w15:restartNumberingAfterBreak="0">
     <w:nsid w:val="09496FD6"/>
     <w:multiLevelType w:val="multilevel"/>
     <w:tmpl w:val="725EFC62"/>
@@ -12682,7 +14304,7 @@
       </w:pPr>
     </w:lvl>
   </w:abstractNum>
-  <w:abstractNum w:abstractNumId="6" w15:restartNumberingAfterBreak="0">
+  <w:abstractNum w:abstractNumId="7" w15:restartNumberingAfterBreak="0">
     <w:nsid w:val="14B05454"/>
     <w:multiLevelType w:val="multilevel"/>
     <w:tmpl w:val="A1667180"/>
@@ -12831,7 +14453,7 @@
       </w:rPr>
     </w:lvl>
   </w:abstractNum>
-  <w:abstractNum w:abstractNumId="7" w15:restartNumberingAfterBreak="0">
+  <w:abstractNum w:abstractNumId="8" w15:restartNumberingAfterBreak="0">
     <w:nsid w:val="23EF3193"/>
     <w:multiLevelType w:val="multilevel"/>
     <w:tmpl w:val="26088AD0"/>
@@ -12980,7 +14602,7 @@
       </w:rPr>
     </w:lvl>
   </w:abstractNum>
-  <w:abstractNum w:abstractNumId="8" w15:restartNumberingAfterBreak="0">
+  <w:abstractNum w:abstractNumId="9" w15:restartNumberingAfterBreak="0">
     <w:nsid w:val="2B2E31FF"/>
     <w:multiLevelType w:val="multilevel"/>
     <w:tmpl w:val="9C54BFA4"/>
@@ -13129,7 +14751,7 @@
       </w:rPr>
     </w:lvl>
   </w:abstractNum>
-  <w:abstractNum w:abstractNumId="9" w15:restartNumberingAfterBreak="0">
+  <w:abstractNum w:abstractNumId="10" w15:restartNumberingAfterBreak="0">
     <w:nsid w:val="2BD53BCA"/>
     <w:multiLevelType w:val="multilevel"/>
     <w:tmpl w:val="00BCA0D8"/>
@@ -13278,7 +14900,7 @@
       </w:rPr>
     </w:lvl>
   </w:abstractNum>
-  <w:abstractNum w:abstractNumId="10" w15:restartNumberingAfterBreak="0">
+  <w:abstractNum w:abstractNumId="11" w15:restartNumberingAfterBreak="0">
     <w:nsid w:val="2BDF4C09"/>
     <w:multiLevelType w:val="multilevel"/>
     <w:tmpl w:val="54F0E588"/>
@@ -13427,7 +15049,7 @@
       </w:rPr>
     </w:lvl>
   </w:abstractNum>
-  <w:abstractNum w:abstractNumId="11" w15:restartNumberingAfterBreak="0">
+  <w:abstractNum w:abstractNumId="12" w15:restartNumberingAfterBreak="0">
     <w:nsid w:val="2C027FDE"/>
     <w:multiLevelType w:val="multilevel"/>
     <w:tmpl w:val="93BE8260"/>
@@ -13540,7 +15162,156 @@
       </w:pPr>
     </w:lvl>
   </w:abstractNum>
-  <w:abstractNum w:abstractNumId="12" w15:restartNumberingAfterBreak="0">
+  <w:abstractNum w:abstractNumId="13" w15:restartNumberingAfterBreak="0">
+    <w:nsid w:val="2D3216DB"/>
+    <w:multiLevelType w:val="multilevel"/>
+    <w:tmpl w:val="24509D46"/>
+    <w:lvl w:ilvl="0">
+      <w:start w:val="1"/>
+      <w:numFmt w:val="bullet"/>
+      <w:lvlText w:val=""/>
+      <w:lvlJc w:val="left"/>
+      <w:pPr>
+        <w:tabs>
+          <w:tab w:val="num" w:pos="720"/>
+        </w:tabs>
+        <w:ind w:left="720" w:hanging="360"/>
+      </w:pPr>
+      <w:rPr>
+        <w:rFonts w:ascii="Symbol" w:hAnsi="Symbol" w:hint="default"/>
+        <w:sz w:val="20"/>
+      </w:rPr>
+    </w:lvl>
+    <w:lvl w:ilvl="1" w:tentative="1">
+      <w:start w:val="1"/>
+      <w:numFmt w:val="bullet"/>
+      <w:lvlText w:val="o"/>
+      <w:lvlJc w:val="left"/>
+      <w:pPr>
+        <w:tabs>
+          <w:tab w:val="num" w:pos="1440"/>
+        </w:tabs>
+        <w:ind w:left="1440" w:hanging="360"/>
+      </w:pPr>
+      <w:rPr>
+        <w:rFonts w:ascii="Courier New" w:hAnsi="Courier New" w:hint="default"/>
+        <w:sz w:val="20"/>
+      </w:rPr>
+    </w:lvl>
+    <w:lvl w:ilvl="2" w:tentative="1">
+      <w:start w:val="1"/>
+      <w:numFmt w:val="bullet"/>
+      <w:lvlText w:val=""/>
+      <w:lvlJc w:val="left"/>
+      <w:pPr>
+        <w:tabs>
+          <w:tab w:val="num" w:pos="2160"/>
+        </w:tabs>
+        <w:ind w:left="2160" w:hanging="360"/>
+      </w:pPr>
+      <w:rPr>
+        <w:rFonts w:ascii="Wingdings" w:hAnsi="Wingdings" w:hint="default"/>
+        <w:sz w:val="20"/>
+      </w:rPr>
+    </w:lvl>
+    <w:lvl w:ilvl="3" w:tentative="1">
+      <w:start w:val="1"/>
+      <w:numFmt w:val="bullet"/>
+      <w:lvlText w:val=""/>
+      <w:lvlJc w:val="left"/>
+      <w:pPr>
+        <w:tabs>
+          <w:tab w:val="num" w:pos="2880"/>
+        </w:tabs>
+        <w:ind w:left="2880" w:hanging="360"/>
+      </w:pPr>
+      <w:rPr>
+        <w:rFonts w:ascii="Wingdings" w:hAnsi="Wingdings" w:hint="default"/>
+        <w:sz w:val="20"/>
+      </w:rPr>
+    </w:lvl>
+    <w:lvl w:ilvl="4" w:tentative="1">
+      <w:start w:val="1"/>
+      <w:numFmt w:val="bullet"/>
+      <w:lvlText w:val=""/>
+      <w:lvlJc w:val="left"/>
+      <w:pPr>
+        <w:tabs>
+          <w:tab w:val="num" w:pos="3600"/>
+        </w:tabs>
+        <w:ind w:left="3600" w:hanging="360"/>
+      </w:pPr>
+      <w:rPr>
+        <w:rFonts w:ascii="Wingdings" w:hAnsi="Wingdings" w:hint="default"/>
+        <w:sz w:val="20"/>
+      </w:rPr>
+    </w:lvl>
+    <w:lvl w:ilvl="5" w:tentative="1">
+      <w:start w:val="1"/>
+      <w:numFmt w:val="bullet"/>
+      <w:lvlText w:val=""/>
+      <w:lvlJc w:val="left"/>
+      <w:pPr>
+        <w:tabs>
+          <w:tab w:val="num" w:pos="4320"/>
+        </w:tabs>
+        <w:ind w:left="4320" w:hanging="360"/>
+      </w:pPr>
+      <w:rPr>
+        <w:rFonts w:ascii="Wingdings" w:hAnsi="Wingdings" w:hint="default"/>
+        <w:sz w:val="20"/>
+      </w:rPr>
+    </w:lvl>
+    <w:lvl w:ilvl="6" w:tentative="1">
+      <w:start w:val="1"/>
+      <w:numFmt w:val="bullet"/>
+      <w:lvlText w:val=""/>
+      <w:lvlJc w:val="left"/>
+      <w:pPr>
+        <w:tabs>
+          <w:tab w:val="num" w:pos="5040"/>
+        </w:tabs>
+        <w:ind w:left="5040" w:hanging="360"/>
+      </w:pPr>
+      <w:rPr>
+        <w:rFonts w:ascii="Wingdings" w:hAnsi="Wingdings" w:hint="default"/>
+        <w:sz w:val="20"/>
+      </w:rPr>
+    </w:lvl>
+    <w:lvl w:ilvl="7" w:tentative="1">
+      <w:start w:val="1"/>
+      <w:numFmt w:val="bullet"/>
+      <w:lvlText w:val=""/>
+      <w:lvlJc w:val="left"/>
+      <w:pPr>
+        <w:tabs>
+          <w:tab w:val="num" w:pos="5760"/>
+        </w:tabs>
+        <w:ind w:left="5760" w:hanging="360"/>
+      </w:pPr>
+      <w:rPr>
+        <w:rFonts w:ascii="Wingdings" w:hAnsi="Wingdings" w:hint="default"/>
+        <w:sz w:val="20"/>
+      </w:rPr>
+    </w:lvl>
+    <w:lvl w:ilvl="8" w:tentative="1">
+      <w:start w:val="1"/>
+      <w:numFmt w:val="bullet"/>
+      <w:lvlText w:val=""/>
+      <w:lvlJc w:val="left"/>
+      <w:pPr>
+        <w:tabs>
+          <w:tab w:val="num" w:pos="6480"/>
+        </w:tabs>
+        <w:ind w:left="6480" w:hanging="360"/>
+      </w:pPr>
+      <w:rPr>
+        <w:rFonts w:ascii="Wingdings" w:hAnsi="Wingdings" w:hint="default"/>
+        <w:sz w:val="20"/>
+      </w:rPr>
+    </w:lvl>
+  </w:abstractNum>
+  <w:abstractNum w:abstractNumId="14" w15:restartNumberingAfterBreak="0">
     <w:nsid w:val="2DA37247"/>
     <w:multiLevelType w:val="multilevel"/>
     <w:tmpl w:val="9F7E56FC"/>
@@ -13689,7 +15460,7 @@
       </w:rPr>
     </w:lvl>
   </w:abstractNum>
-  <w:abstractNum w:abstractNumId="13" w15:restartNumberingAfterBreak="0">
+  <w:abstractNum w:abstractNumId="15" w15:restartNumberingAfterBreak="0">
     <w:nsid w:val="33CF3F13"/>
     <w:multiLevelType w:val="multilevel"/>
     <w:tmpl w:val="F34A0D50"/>
@@ -13838,7 +15609,7 @@
       </w:rPr>
     </w:lvl>
   </w:abstractNum>
-  <w:abstractNum w:abstractNumId="14" w15:restartNumberingAfterBreak="0">
+  <w:abstractNum w:abstractNumId="16" w15:restartNumberingAfterBreak="0">
     <w:nsid w:val="35553302"/>
     <w:multiLevelType w:val="multilevel"/>
     <w:tmpl w:val="40A6743E"/>
@@ -13987,7 +15758,7 @@
       </w:rPr>
     </w:lvl>
   </w:abstractNum>
-  <w:abstractNum w:abstractNumId="15" w15:restartNumberingAfterBreak="0">
+  <w:abstractNum w:abstractNumId="17" w15:restartNumberingAfterBreak="0">
     <w:nsid w:val="35D03B82"/>
     <w:multiLevelType w:val="multilevel"/>
     <w:tmpl w:val="67F23E52"/>
@@ -14136,7 +15907,7 @@
       </w:rPr>
     </w:lvl>
   </w:abstractNum>
-  <w:abstractNum w:abstractNumId="16" w15:restartNumberingAfterBreak="0">
+  <w:abstractNum w:abstractNumId="18" w15:restartNumberingAfterBreak="0">
     <w:nsid w:val="3BB3031B"/>
     <w:multiLevelType w:val="multilevel"/>
     <w:tmpl w:val="95E63E9E"/>
@@ -14285,7 +16056,7 @@
       </w:rPr>
     </w:lvl>
   </w:abstractNum>
-  <w:abstractNum w:abstractNumId="17" w15:restartNumberingAfterBreak="0">
+  <w:abstractNum w:abstractNumId="19" w15:restartNumberingAfterBreak="0">
     <w:nsid w:val="3E2959B9"/>
     <w:multiLevelType w:val="multilevel"/>
     <w:tmpl w:val="89C612DA"/>
@@ -14434,7 +16205,7 @@
       </w:rPr>
     </w:lvl>
   </w:abstractNum>
-  <w:abstractNum w:abstractNumId="18" w15:restartNumberingAfterBreak="0">
+  <w:abstractNum w:abstractNumId="20" w15:restartNumberingAfterBreak="0">
     <w:nsid w:val="4A3C3674"/>
     <w:multiLevelType w:val="multilevel"/>
     <w:tmpl w:val="7376D456"/>
@@ -14583,7 +16354,7 @@
       </w:rPr>
     </w:lvl>
   </w:abstractNum>
-  <w:abstractNum w:abstractNumId="19" w15:restartNumberingAfterBreak="0">
+  <w:abstractNum w:abstractNumId="21" w15:restartNumberingAfterBreak="0">
     <w:nsid w:val="4DEE5DE1"/>
     <w:multiLevelType w:val="multilevel"/>
     <w:tmpl w:val="8FC85292"/>
@@ -14732,7 +16503,7 @@
       </w:rPr>
     </w:lvl>
   </w:abstractNum>
-  <w:abstractNum w:abstractNumId="20" w15:restartNumberingAfterBreak="0">
+  <w:abstractNum w:abstractNumId="22" w15:restartNumberingAfterBreak="0">
     <w:nsid w:val="509D4B9D"/>
     <w:multiLevelType w:val="multilevel"/>
     <w:tmpl w:val="1F4E5A68"/>
@@ -14881,7 +16652,7 @@
       </w:rPr>
     </w:lvl>
   </w:abstractNum>
-  <w:abstractNum w:abstractNumId="21" w15:restartNumberingAfterBreak="0">
+  <w:abstractNum w:abstractNumId="23" w15:restartNumberingAfterBreak="0">
     <w:nsid w:val="58D6491B"/>
     <w:multiLevelType w:val="multilevel"/>
     <w:tmpl w:val="8F10E664"/>
@@ -14994,7 +16765,7 @@
       </w:pPr>
     </w:lvl>
   </w:abstractNum>
-  <w:abstractNum w:abstractNumId="22" w15:restartNumberingAfterBreak="0">
+  <w:abstractNum w:abstractNumId="24" w15:restartNumberingAfterBreak="0">
     <w:nsid w:val="5CCD6F98"/>
     <w:multiLevelType w:val="multilevel"/>
     <w:tmpl w:val="ED346C78"/>
@@ -15107,7 +16878,7 @@
       </w:pPr>
     </w:lvl>
   </w:abstractNum>
-  <w:abstractNum w:abstractNumId="23" w15:restartNumberingAfterBreak="0">
+  <w:abstractNum w:abstractNumId="25" w15:restartNumberingAfterBreak="0">
     <w:nsid w:val="67EF18AD"/>
     <w:multiLevelType w:val="multilevel"/>
     <w:tmpl w:val="9912D61A"/>
@@ -15256,7 +17027,7 @@
       </w:rPr>
     </w:lvl>
   </w:abstractNum>
-  <w:abstractNum w:abstractNumId="24" w15:restartNumberingAfterBreak="0">
+  <w:abstractNum w:abstractNumId="26" w15:restartNumberingAfterBreak="0">
     <w:nsid w:val="72B270E2"/>
     <w:multiLevelType w:val="multilevel"/>
     <w:tmpl w:val="BC767FF2"/>
@@ -15405,7 +17176,156 @@
       </w:rPr>
     </w:lvl>
   </w:abstractNum>
-  <w:abstractNum w:abstractNumId="25" w15:restartNumberingAfterBreak="0">
+  <w:abstractNum w:abstractNumId="27" w15:restartNumberingAfterBreak="0">
+    <w:nsid w:val="72D35979"/>
+    <w:multiLevelType w:val="multilevel"/>
+    <w:tmpl w:val="7A0A4920"/>
+    <w:lvl w:ilvl="0">
+      <w:start w:val="1"/>
+      <w:numFmt w:val="bullet"/>
+      <w:lvlText w:val=""/>
+      <w:lvlJc w:val="left"/>
+      <w:pPr>
+        <w:tabs>
+          <w:tab w:val="num" w:pos="720"/>
+        </w:tabs>
+        <w:ind w:left="720" w:hanging="360"/>
+      </w:pPr>
+      <w:rPr>
+        <w:rFonts w:ascii="Symbol" w:hAnsi="Symbol" w:hint="default"/>
+        <w:sz w:val="20"/>
+      </w:rPr>
+    </w:lvl>
+    <w:lvl w:ilvl="1" w:tentative="1">
+      <w:start w:val="1"/>
+      <w:numFmt w:val="bullet"/>
+      <w:lvlText w:val="o"/>
+      <w:lvlJc w:val="left"/>
+      <w:pPr>
+        <w:tabs>
+          <w:tab w:val="num" w:pos="1440"/>
+        </w:tabs>
+        <w:ind w:left="1440" w:hanging="360"/>
+      </w:pPr>
+      <w:rPr>
+        <w:rFonts w:ascii="Courier New" w:hAnsi="Courier New" w:hint="default"/>
+        <w:sz w:val="20"/>
+      </w:rPr>
+    </w:lvl>
+    <w:lvl w:ilvl="2" w:tentative="1">
+      <w:start w:val="1"/>
+      <w:numFmt w:val="bullet"/>
+      <w:lvlText w:val=""/>
+      <w:lvlJc w:val="left"/>
+      <w:pPr>
+        <w:tabs>
+          <w:tab w:val="num" w:pos="2160"/>
+        </w:tabs>
+        <w:ind w:left="2160" w:hanging="360"/>
+      </w:pPr>
+      <w:rPr>
+        <w:rFonts w:ascii="Wingdings" w:hAnsi="Wingdings" w:hint="default"/>
+        <w:sz w:val="20"/>
+      </w:rPr>
+    </w:lvl>
+    <w:lvl w:ilvl="3" w:tentative="1">
+      <w:start w:val="1"/>
+      <w:numFmt w:val="bullet"/>
+      <w:lvlText w:val=""/>
+      <w:lvlJc w:val="left"/>
+      <w:pPr>
+        <w:tabs>
+          <w:tab w:val="num" w:pos="2880"/>
+        </w:tabs>
+        <w:ind w:left="2880" w:hanging="360"/>
+      </w:pPr>
+      <w:rPr>
+        <w:rFonts w:ascii="Wingdings" w:hAnsi="Wingdings" w:hint="default"/>
+        <w:sz w:val="20"/>
+      </w:rPr>
+    </w:lvl>
+    <w:lvl w:ilvl="4" w:tentative="1">
+      <w:start w:val="1"/>
+      <w:numFmt w:val="bullet"/>
+      <w:lvlText w:val=""/>
+      <w:lvlJc w:val="left"/>
+      <w:pPr>
+        <w:tabs>
+          <w:tab w:val="num" w:pos="3600"/>
+        </w:tabs>
+        <w:ind w:left="3600" w:hanging="360"/>
+      </w:pPr>
+      <w:rPr>
+        <w:rFonts w:ascii="Wingdings" w:hAnsi="Wingdings" w:hint="default"/>
+        <w:sz w:val="20"/>
+      </w:rPr>
+    </w:lvl>
+    <w:lvl w:ilvl="5" w:tentative="1">
+      <w:start w:val="1"/>
+      <w:numFmt w:val="bullet"/>
+      <w:lvlText w:val=""/>
+      <w:lvlJc w:val="left"/>
+      <w:pPr>
+        <w:tabs>
+          <w:tab w:val="num" w:pos="4320"/>
+        </w:tabs>
+        <w:ind w:left="4320" w:hanging="360"/>
+      </w:pPr>
+      <w:rPr>
+        <w:rFonts w:ascii="Wingdings" w:hAnsi="Wingdings" w:hint="default"/>
+        <w:sz w:val="20"/>
+      </w:rPr>
+    </w:lvl>
+    <w:lvl w:ilvl="6" w:tentative="1">
+      <w:start w:val="1"/>
+      <w:numFmt w:val="bullet"/>
+      <w:lvlText w:val=""/>
+      <w:lvlJc w:val="left"/>
+      <w:pPr>
+        <w:tabs>
+          <w:tab w:val="num" w:pos="5040"/>
+        </w:tabs>
+        <w:ind w:left="5040" w:hanging="360"/>
+      </w:pPr>
+      <w:rPr>
+        <w:rFonts w:ascii="Wingdings" w:hAnsi="Wingdings" w:hint="default"/>
+        <w:sz w:val="20"/>
+      </w:rPr>
+    </w:lvl>
+    <w:lvl w:ilvl="7" w:tentative="1">
+      <w:start w:val="1"/>
+      <w:numFmt w:val="bullet"/>
+      <w:lvlText w:val=""/>
+      <w:lvlJc w:val="left"/>
+      <w:pPr>
+        <w:tabs>
+          <w:tab w:val="num" w:pos="5760"/>
+        </w:tabs>
+        <w:ind w:left="5760" w:hanging="360"/>
+      </w:pPr>
+      <w:rPr>
+        <w:rFonts w:ascii="Wingdings" w:hAnsi="Wingdings" w:hint="default"/>
+        <w:sz w:val="20"/>
+      </w:rPr>
+    </w:lvl>
+    <w:lvl w:ilvl="8" w:tentative="1">
+      <w:start w:val="1"/>
+      <w:numFmt w:val="bullet"/>
+      <w:lvlText w:val=""/>
+      <w:lvlJc w:val="left"/>
+      <w:pPr>
+        <w:tabs>
+          <w:tab w:val="num" w:pos="6480"/>
+        </w:tabs>
+        <w:ind w:left="6480" w:hanging="360"/>
+      </w:pPr>
+      <w:rPr>
+        <w:rFonts w:ascii="Wingdings" w:hAnsi="Wingdings" w:hint="default"/>
+        <w:sz w:val="20"/>
+      </w:rPr>
+    </w:lvl>
+  </w:abstractNum>
+  <w:abstractNum w:abstractNumId="28" w15:restartNumberingAfterBreak="0">
     <w:nsid w:val="78C61806"/>
     <w:multiLevelType w:val="multilevel"/>
     <w:tmpl w:val="BD90F0C0"/>
@@ -15554,7 +17474,7 @@
       </w:rPr>
     </w:lvl>
   </w:abstractNum>
-  <w:abstractNum w:abstractNumId="26" w15:restartNumberingAfterBreak="0">
+  <w:abstractNum w:abstractNumId="29" w15:restartNumberingAfterBreak="0">
     <w:nsid w:val="7DCF3A56"/>
     <w:multiLevelType w:val="multilevel"/>
     <w:tmpl w:val="6F0A3806"/>
@@ -15703,7 +17623,7 @@
       </w:rPr>
     </w:lvl>
   </w:abstractNum>
-  <w:abstractNum w:abstractNumId="27" w15:restartNumberingAfterBreak="0">
+  <w:abstractNum w:abstractNumId="30" w15:restartNumberingAfterBreak="0">
     <w:nsid w:val="7E28183B"/>
     <w:multiLevelType w:val="multilevel"/>
     <w:tmpl w:val="67E2A9AA"/>
@@ -15852,7 +17772,7 @@
       </w:rPr>
     </w:lvl>
   </w:abstractNum>
-  <w:abstractNum w:abstractNumId="28" w15:restartNumberingAfterBreak="0">
+  <w:abstractNum w:abstractNumId="31" w15:restartNumberingAfterBreak="0">
     <w:nsid w:val="7E6B29BA"/>
     <w:multiLevelType w:val="multilevel"/>
     <w:tmpl w:val="17600516"/>
@@ -16002,91 +17922,100 @@
     </w:lvl>
   </w:abstractNum>
   <w:num w:numId="1" w16cid:durableId="197277277">
-    <w:abstractNumId w:val="9"/>
+    <w:abstractNumId w:val="10"/>
   </w:num>
   <w:num w:numId="2" w16cid:durableId="1371226839">
+    <w:abstractNumId w:val="20"/>
+  </w:num>
+  <w:num w:numId="3" w16cid:durableId="419446904">
+    <w:abstractNumId w:val="25"/>
+  </w:num>
+  <w:num w:numId="4" w16cid:durableId="994181492">
+    <w:abstractNumId w:val="30"/>
+  </w:num>
+  <w:num w:numId="5" w16cid:durableId="1043821426">
+    <w:abstractNumId w:val="28"/>
+  </w:num>
+  <w:num w:numId="6" w16cid:durableId="1469863382">
     <w:abstractNumId w:val="18"/>
   </w:num>
-  <w:num w:numId="3" w16cid:durableId="419446904">
+  <w:num w:numId="7" w16cid:durableId="360710718">
+    <w:abstractNumId w:val="15"/>
+  </w:num>
+  <w:num w:numId="8" w16cid:durableId="955333728">
+    <w:abstractNumId w:val="14"/>
+  </w:num>
+  <w:num w:numId="9" w16cid:durableId="1364135561">
+    <w:abstractNumId w:val="29"/>
+  </w:num>
+  <w:num w:numId="10" w16cid:durableId="396126950">
     <w:abstractNumId w:val="23"/>
   </w:num>
-  <w:num w:numId="4" w16cid:durableId="994181492">
-    <w:abstractNumId w:val="27"/>
+  <w:num w:numId="11" w16cid:durableId="809325700">
+    <w:abstractNumId w:val="17"/>
   </w:num>
-  <w:num w:numId="5" w16cid:durableId="1043821426">
-    <w:abstractNumId w:val="25"/>
+  <w:num w:numId="12" w16cid:durableId="1653288711">
+    <w:abstractNumId w:val="6"/>
   </w:num>
-  <w:num w:numId="6" w16cid:durableId="1469863382">
-    <w:abstractNumId w:val="16"/>
-  </w:num>
-  <w:num w:numId="7" w16cid:durableId="360710718">
-    <w:abstractNumId w:val="13"/>
-  </w:num>
-  <w:num w:numId="8" w16cid:durableId="955333728">
-    <w:abstractNumId w:val="12"/>
-  </w:num>
-  <w:num w:numId="9" w16cid:durableId="1364135561">
-    <w:abstractNumId w:val="26"/>
-  </w:num>
-  <w:num w:numId="10" w16cid:durableId="396126950">
+  <w:num w:numId="13" w16cid:durableId="279504">
     <w:abstractNumId w:val="21"/>
   </w:num>
-  <w:num w:numId="11" w16cid:durableId="809325700">
-    <w:abstractNumId w:val="15"/>
-  </w:num>
-  <w:num w:numId="12" w16cid:durableId="1653288711">
-    <w:abstractNumId w:val="5"/>
-  </w:num>
-  <w:num w:numId="13" w16cid:durableId="279504">
-    <w:abstractNumId w:val="19"/>
-  </w:num>
   <w:num w:numId="14" w16cid:durableId="1650939393">
-    <w:abstractNumId w:val="6"/>
+    <w:abstractNumId w:val="7"/>
   </w:num>
   <w:num w:numId="15" w16cid:durableId="660624279">
-    <w:abstractNumId w:val="10"/>
+    <w:abstractNumId w:val="11"/>
   </w:num>
   <w:num w:numId="16" w16cid:durableId="364605056">
     <w:abstractNumId w:val="0"/>
   </w:num>
   <w:num w:numId="17" w16cid:durableId="1168206873">
+    <w:abstractNumId w:val="3"/>
+  </w:num>
+  <w:num w:numId="18" w16cid:durableId="1729111585">
+    <w:abstractNumId w:val="22"/>
+  </w:num>
+  <w:num w:numId="19" w16cid:durableId="1775595751">
+    <w:abstractNumId w:val="4"/>
+  </w:num>
+  <w:num w:numId="20" w16cid:durableId="1677996458">
+    <w:abstractNumId w:val="8"/>
+  </w:num>
+  <w:num w:numId="21" w16cid:durableId="914970241">
     <w:abstractNumId w:val="2"/>
   </w:num>
-  <w:num w:numId="18" w16cid:durableId="1729111585">
-    <w:abstractNumId w:val="20"/>
+  <w:num w:numId="22" w16cid:durableId="1313604523">
+    <w:abstractNumId w:val="24"/>
   </w:num>
-  <w:num w:numId="19" w16cid:durableId="1775595751">
-    <w:abstractNumId w:val="3"/>
+  <w:num w:numId="23" w16cid:durableId="1968464805">
+    <w:abstractNumId w:val="26"/>
   </w:num>
-  <w:num w:numId="20" w16cid:durableId="1677996458">
-    <w:abstractNumId w:val="7"/>
+  <w:num w:numId="24" w16cid:durableId="7603547">
+    <w:abstractNumId w:val="5"/>
   </w:num>
-  <w:num w:numId="21" w16cid:durableId="914970241">
+  <w:num w:numId="25" w16cid:durableId="575169116">
+    <w:abstractNumId w:val="12"/>
+  </w:num>
+  <w:num w:numId="26" w16cid:durableId="1284573574">
+    <w:abstractNumId w:val="19"/>
+  </w:num>
+  <w:num w:numId="27" w16cid:durableId="1195583698">
+    <w:abstractNumId w:val="31"/>
+  </w:num>
+  <w:num w:numId="28" w16cid:durableId="1890680377">
+    <w:abstractNumId w:val="16"/>
+  </w:num>
+  <w:num w:numId="29" w16cid:durableId="1110390729">
+    <w:abstractNumId w:val="9"/>
+  </w:num>
+  <w:num w:numId="30" w16cid:durableId="1435436695">
     <w:abstractNumId w:val="1"/>
   </w:num>
-  <w:num w:numId="22" w16cid:durableId="1313604523">
-    <w:abstractNumId w:val="22"/>
+  <w:num w:numId="31" w16cid:durableId="1907108580">
+    <w:abstractNumId w:val="27"/>
   </w:num>
-  <w:num w:numId="23" w16cid:durableId="1968464805">
-    <w:abstractNumId w:val="24"/>
-  </w:num>
-  <w:num w:numId="24" w16cid:durableId="7603547">
-    <w:abstractNumId w:val="4"/>
-  </w:num>
-  <w:num w:numId="25" w16cid:durableId="575169116">
-    <w:abstractNumId w:val="11"/>
-  </w:num>
-  <w:num w:numId="26" w16cid:durableId="1284573574">
-    <w:abstractNumId w:val="17"/>
-  </w:num>
-  <w:num w:numId="27" w16cid:durableId="1195583698">
-    <w:abstractNumId w:val="28"/>
-  </w:num>
-  <w:num w:numId="28" w16cid:durableId="1890680377">
-    <w:abstractNumId w:val="14"/>
-  </w:num>
-  <w:num w:numId="29" w16cid:durableId="1110390729">
-    <w:abstractNumId w:val="8"/>
+  <w:num w:numId="32" w16cid:durableId="44842800">
+    <w:abstractNumId w:val="13"/>
   </w:num>
 </w:numbering>
 </file>

</xml_diff>

<commit_message>
- how to find out what is base64 format of a string in buffer?
</commit_message>
<xml_diff>
--- a/node-js/Buffer From Encoding.docx
+++ b/node-js/Buffer From Encoding.docx
@@ -918,6 +918,9 @@
     </w:p>
     <w:p>
       <w:r>
+        <w:rPr>
+          <w:noProof/>
+        </w:rPr>
         <w:drawing>
           <wp:inline distT="0" distB="0" distL="0" distR="0" wp14:anchorId="1547178B" wp14:editId="405B8C63">
             <wp:extent cx="190500" cy="190500"/>
@@ -968,6 +971,9 @@
         </w:drawing>
       </w:r>
       <w:r>
+        <w:rPr>
+          <w:noProof/>
+        </w:rPr>
         <w:drawing>
           <wp:inline distT="0" distB="0" distL="0" distR="0" wp14:anchorId="635EFC4C" wp14:editId="6A8AB3E3">
             <wp:extent cx="190500" cy="190500"/>
@@ -1018,6 +1024,9 @@
         </w:drawing>
       </w:r>
       <w:r>
+        <w:rPr>
+          <w:noProof/>
+        </w:rPr>
         <w:drawing>
           <wp:inline distT="0" distB="0" distL="0" distR="0" wp14:anchorId="4E01D06B" wp14:editId="48597B40">
             <wp:extent cx="190500" cy="190500"/>
@@ -1107,6 +1116,9 @@
     </w:p>
     <w:p>
       <w:r>
+        <w:rPr>
+          <w:noProof/>
+        </w:rPr>
         <w:drawing>
           <wp:inline distT="0" distB="0" distL="0" distR="0" wp14:anchorId="36A5666C" wp14:editId="2F6D5668">
             <wp:extent cx="784860" cy="784860"/>
@@ -1159,6 +1171,9 @@
     </w:p>
     <w:p>
       <w:r>
+        <w:rPr>
+          <w:noProof/>
+        </w:rPr>
         <w:drawing>
           <wp:inline distT="0" distB="0" distL="0" distR="0" wp14:anchorId="02571701" wp14:editId="20A3E1F4">
             <wp:extent cx="152400" cy="152400"/>
@@ -1240,6 +1255,9 @@
     </w:p>
     <w:p>
       <w:r>
+        <w:rPr>
+          <w:noProof/>
+        </w:rPr>
         <w:drawing>
           <wp:inline distT="0" distB="0" distL="0" distR="0" wp14:anchorId="621A25B4" wp14:editId="3DE0A9FA">
             <wp:extent cx="152400" cy="152400"/>
@@ -1321,6 +1339,9 @@
     </w:p>
     <w:p>
       <w:r>
+        <w:rPr>
+          <w:noProof/>
+        </w:rPr>
         <w:lastRenderedPageBreak/>
         <w:drawing>
           <wp:inline distT="0" distB="0" distL="0" distR="0" wp14:anchorId="202547E8" wp14:editId="1CE783E4">
@@ -1374,6 +1395,9 @@
     </w:p>
     <w:p>
       <w:r>
+        <w:rPr>
+          <w:noProof/>
+        </w:rPr>
         <w:drawing>
           <wp:inline distT="0" distB="0" distL="0" distR="0" wp14:anchorId="51444DC5" wp14:editId="5ED793E5">
             <wp:extent cx="152400" cy="152400"/>
@@ -2922,6 +2946,9 @@
     </w:p>
     <w:p>
       <w:r>
+        <w:rPr>
+          <w:noProof/>
+        </w:rPr>
         <w:drawing>
           <wp:inline distT="0" distB="0" distL="0" distR="0" wp14:anchorId="44686B23" wp14:editId="485FC302">
             <wp:extent cx="1219200" cy="1219200"/>
@@ -2972,6 +2999,9 @@
         </w:drawing>
       </w:r>
       <w:r>
+        <w:rPr>
+          <w:noProof/>
+        </w:rPr>
         <mc:AlternateContent>
           <mc:Choice Requires="wps">
             <w:drawing>
@@ -3040,6 +3070,9 @@
         </mc:AlternateContent>
       </w:r>
       <w:r>
+        <w:rPr>
+          <w:noProof/>
+        </w:rPr>
         <w:drawing>
           <wp:inline distT="0" distB="0" distL="0" distR="0" wp14:anchorId="43622732" wp14:editId="1E843250">
             <wp:extent cx="1219200" cy="1219200"/>
@@ -3121,6 +3154,9 @@
     </w:p>
     <w:p>
       <w:r>
+        <w:rPr>
+          <w:noProof/>
+        </w:rPr>
         <w:drawing>
           <wp:inline distT="0" distB="0" distL="0" distR="0" wp14:anchorId="27868866" wp14:editId="7BA77C0D">
             <wp:extent cx="3025140" cy="1516380"/>
@@ -3173,6 +3209,9 @@
     </w:p>
     <w:p>
       <w:r>
+        <w:rPr>
+          <w:noProof/>
+        </w:rPr>
         <w:drawing>
           <wp:inline distT="0" distB="0" distL="0" distR="0" wp14:anchorId="6F2B85B9" wp14:editId="2CA01CB5">
             <wp:extent cx="1219200" cy="1219200"/>
@@ -3272,6 +3311,9 @@
     </w:p>
     <w:p>
       <w:r>
+        <w:rPr>
+          <w:noProof/>
+        </w:rPr>
         <w:lastRenderedPageBreak/>
         <w:drawing>
           <wp:inline distT="0" distB="0" distL="0" distR="0" wp14:anchorId="73B5EDC9" wp14:editId="0E39F356">
@@ -3325,6 +3367,9 @@
     </w:p>
     <w:p>
       <w:r>
+        <w:rPr>
+          <w:noProof/>
+        </w:rPr>
         <mc:AlternateContent>
           <mc:Choice Requires="wps">
             <w:drawing>
@@ -3432,6 +3477,9 @@
     </w:p>
     <w:p>
       <w:r>
+        <w:rPr>
+          <w:noProof/>
+        </w:rPr>
         <w:drawing>
           <wp:inline distT="0" distB="0" distL="0" distR="0" wp14:anchorId="59BA1C07" wp14:editId="3C6AF791">
             <wp:extent cx="3322320" cy="1371600"/>
@@ -3484,6 +3532,9 @@
     </w:p>
     <w:p>
       <w:r>
+        <w:rPr>
+          <w:noProof/>
+        </w:rPr>
         <w:drawing>
           <wp:inline distT="0" distB="0" distL="0" distR="0" wp14:anchorId="53D213F4" wp14:editId="5E046B4A">
             <wp:extent cx="1219200" cy="1219200"/>
@@ -4427,6 +4478,9 @@
     </w:p>
     <w:p>
       <w:r>
+        <w:rPr>
+          <w:noProof/>
+        </w:rPr>
         <w:drawing>
           <wp:inline distT="0" distB="0" distL="0" distR="0" wp14:anchorId="3D54688F" wp14:editId="5E0CD62D">
             <wp:extent cx="1219200" cy="1219200"/>
@@ -4477,6 +4531,9 @@
         </w:drawing>
       </w:r>
       <w:r>
+        <w:rPr>
+          <w:noProof/>
+        </w:rPr>
         <w:drawing>
           <wp:inline distT="0" distB="0" distL="0" distR="0" wp14:anchorId="6A3C0585" wp14:editId="1FB75F73">
             <wp:extent cx="1219200" cy="1219200"/>
@@ -4527,6 +4584,9 @@
         </w:drawing>
       </w:r>
       <w:r>
+        <w:rPr>
+          <w:noProof/>
+        </w:rPr>
         <w:drawing>
           <wp:inline distT="0" distB="0" distL="0" distR="0" wp14:anchorId="1BACBBC6" wp14:editId="3A8145E1">
             <wp:extent cx="1219200" cy="1219200"/>
@@ -4626,6 +4686,9 @@
     </w:p>
     <w:p>
       <w:r>
+        <w:rPr>
+          <w:noProof/>
+        </w:rPr>
         <w:drawing>
           <wp:inline distT="0" distB="0" distL="0" distR="0" wp14:anchorId="4CAC6974" wp14:editId="7D509CA6">
             <wp:extent cx="1219200" cy="1219200"/>
@@ -4720,6 +4783,9 @@
     </w:p>
     <w:p>
       <w:r>
+        <w:rPr>
+          <w:noProof/>
+        </w:rPr>
         <w:drawing>
           <wp:inline distT="0" distB="0" distL="0" distR="0" wp14:anchorId="0D566EC5" wp14:editId="5336E190">
             <wp:extent cx="3025140" cy="1516380"/>
@@ -4772,6 +4838,9 @@
     </w:p>
     <w:p>
       <w:r>
+        <w:rPr>
+          <w:noProof/>
+        </w:rPr>
         <w:lastRenderedPageBreak/>
         <w:drawing>
           <wp:inline distT="0" distB="0" distL="0" distR="0" wp14:anchorId="47E4370F" wp14:editId="50B1A6CD">
@@ -4848,6 +4917,9 @@
     </w:p>
     <w:p>
       <w:r>
+        <w:rPr>
+          <w:noProof/>
+        </w:rPr>
         <w:drawing>
           <wp:inline distT="0" distB="0" distL="0" distR="0" wp14:anchorId="19211CD5" wp14:editId="1905C84B">
             <wp:extent cx="2141220" cy="2141220"/>
@@ -4900,6 +4972,9 @@
     </w:p>
     <w:p>
       <w:r>
+        <w:rPr>
+          <w:noProof/>
+        </w:rPr>
         <w:drawing>
           <wp:inline distT="0" distB="0" distL="0" distR="0" wp14:anchorId="265BDDD0" wp14:editId="11DF5E2A">
             <wp:extent cx="1219200" cy="1219200"/>
@@ -5042,7 +5117,7 @@
     <w:p>
       <w:r>
         <w:pict w14:anchorId="2D594483">
-          <v:rect id="_x0000_i1193" style="width:0;height:1.5pt" o:hralign="center" o:hrstd="t" o:hr="t" fillcolor="#a0a0a0" stroked="f"/>
+          <v:rect id="_x0000_i1025" style="width:0;height:1.5pt" o:hralign="center" o:hrstd="t" o:hr="t" fillcolor="#a0a0a0" stroked="f"/>
         </w:pict>
       </w:r>
     </w:p>
@@ -5342,7 +5417,7 @@
     <w:p>
       <w:r>
         <w:pict w14:anchorId="54A62829">
-          <v:rect id="_x0000_i1194" style="width:0;height:1.5pt" o:hralign="center" o:hrstd="t" o:hr="t" fillcolor="#a0a0a0" stroked="f"/>
+          <v:rect id="_x0000_i1026" style="width:0;height:1.5pt" o:hralign="center" o:hrstd="t" o:hr="t" fillcolor="#a0a0a0" stroked="f"/>
         </w:pict>
       </w:r>
     </w:p>
@@ -5809,7 +5884,7 @@
     <w:p>
       <w:r>
         <w:pict w14:anchorId="055F8D2E">
-          <v:rect id="_x0000_i1195" style="width:0;height:1.5pt" o:hralign="center" o:hrstd="t" o:hr="t" fillcolor="#a0a0a0" stroked="f"/>
+          <v:rect id="_x0000_i1027" style="width:0;height:1.5pt" o:hralign="center" o:hrstd="t" o:hr="t" fillcolor="#a0a0a0" stroked="f"/>
         </w:pict>
       </w:r>
     </w:p>
@@ -5962,7 +6037,7 @@
     <w:p>
       <w:r>
         <w:pict w14:anchorId="23050ACD">
-          <v:rect id="_x0000_i1422" style="width:0;height:1.5pt" o:hralign="center" o:hrstd="t" o:hr="t" fillcolor="#a0a0a0" stroked="f"/>
+          <v:rect id="_x0000_i1028" style="width:0;height:1.5pt" o:hralign="center" o:hrstd="t" o:hr="t" fillcolor="#a0a0a0" stroked="f"/>
         </w:pict>
       </w:r>
     </w:p>
@@ -6278,7 +6353,7 @@
     <w:p>
       <w:r>
         <w:pict w14:anchorId="137C26D4">
-          <v:rect id="_x0000_i1423" style="width:0;height:1.5pt" o:hralign="center" o:hrstd="t" o:hr="t" fillcolor="#a0a0a0" stroked="f"/>
+          <v:rect id="_x0000_i1029" style="width:0;height:1.5pt" o:hralign="center" o:hrstd="t" o:hr="t" fillcolor="#a0a0a0" stroked="f"/>
         </w:pict>
       </w:r>
     </w:p>
@@ -6840,6 +6915,9 @@
     </w:p>
     <w:p>
       <w:r>
+        <w:rPr>
+          <w:noProof/>
+        </w:rPr>
         <mc:AlternateContent>
           <mc:Choice Requires="wps">
             <w:drawing>
@@ -6908,6 +6986,9 @@
         </mc:AlternateContent>
       </w:r>
       <w:r>
+        <w:rPr>
+          <w:noProof/>
+        </w:rPr>
         <w:drawing>
           <wp:inline distT="0" distB="0" distL="0" distR="0" wp14:anchorId="63263B5D" wp14:editId="5E415E9C">
             <wp:extent cx="1219200" cy="1219200"/>
@@ -6958,6 +7039,9 @@
         </w:drawing>
       </w:r>
       <w:r>
+        <w:rPr>
+          <w:noProof/>
+        </w:rPr>
         <w:drawing>
           <wp:inline distT="0" distB="0" distL="0" distR="0" wp14:anchorId="4CC05CAA" wp14:editId="6E996B3C">
             <wp:extent cx="1219200" cy="1211580"/>
@@ -7031,6 +7115,9 @@
     </w:p>
     <w:p>
       <w:r>
+        <w:rPr>
+          <w:noProof/>
+        </w:rPr>
         <w:lastRenderedPageBreak/>
         <w:drawing>
           <wp:inline distT="0" distB="0" distL="0" distR="0" wp14:anchorId="0AAFC598" wp14:editId="4CE73F50">
@@ -7084,6 +7171,9 @@
     </w:p>
     <w:p>
       <w:r>
+        <w:rPr>
+          <w:noProof/>
+        </w:rPr>
         <mc:AlternateContent>
           <mc:Choice Requires="wps">
             <w:drawing>
@@ -7175,6 +7265,9 @@
     </w:p>
     <w:p>
       <w:r>
+        <w:rPr>
+          <w:noProof/>
+        </w:rPr>
         <w:drawing>
           <wp:inline distT="0" distB="0" distL="0" distR="0" wp14:anchorId="606E0841" wp14:editId="113E7A98">
             <wp:extent cx="3025140" cy="1516380"/>
@@ -7227,6 +7320,9 @@
     </w:p>
     <w:p>
       <w:r>
+        <w:rPr>
+          <w:noProof/>
+        </w:rPr>
         <w:drawing>
           <wp:inline distT="0" distB="0" distL="0" distR="0" wp14:anchorId="783F91CE" wp14:editId="498D860F">
             <wp:extent cx="1219200" cy="1219200"/>
@@ -7310,6 +7406,9 @@
     </w:p>
     <w:p>
       <w:r>
+        <w:rPr>
+          <w:noProof/>
+        </w:rPr>
         <w:lastRenderedPageBreak/>
         <w:drawing>
           <wp:inline distT="0" distB="0" distL="0" distR="0" wp14:anchorId="39C99721" wp14:editId="5709320F">
@@ -7363,6 +7462,9 @@
     </w:p>
     <w:p>
       <w:r>
+        <w:rPr>
+          <w:noProof/>
+        </w:rPr>
         <w:drawing>
           <wp:inline distT="0" distB="0" distL="0" distR="0" wp14:anchorId="05B79A3E" wp14:editId="007A8D34">
             <wp:extent cx="1219200" cy="1211580"/>
@@ -7515,7 +7617,7 @@
     <w:p>
       <w:r>
         <w:pict w14:anchorId="6FA4FA69">
-          <v:rect id="_x0000_i1433" style="width:0;height:1.5pt" o:hralign="center" o:hrstd="t" o:hr="t" fillcolor="#a0a0a0" stroked="f"/>
+          <v:rect id="_x0000_i1030" style="width:0;height:1.5pt" o:hralign="center" o:hrstd="t" o:hr="t" fillcolor="#a0a0a0" stroked="f"/>
         </w:pict>
       </w:r>
     </w:p>
@@ -8090,7 +8192,7 @@
     <w:p>
       <w:r>
         <w:pict w14:anchorId="27278FB3">
-          <v:rect id="_x0000_i1434" style="width:0;height:1.5pt" o:hralign="center" o:hrstd="t" o:hr="t" fillcolor="#a0a0a0" stroked="f"/>
+          <v:rect id="_x0000_i1031" style="width:0;height:1.5pt" o:hralign="center" o:hrstd="t" o:hr="t" fillcolor="#a0a0a0" stroked="f"/>
         </w:pict>
       </w:r>
     </w:p>
@@ -8391,7 +8493,7 @@
     <w:p>
       <w:r>
         <w:pict w14:anchorId="33C07BC1">
-          <v:rect id="_x0000_i1435" style="width:0;height:1.5pt" o:hralign="center" o:hrstd="t" o:hr="t" fillcolor="#a0a0a0" stroked="f"/>
+          <v:rect id="_x0000_i1032" style="width:0;height:1.5pt" o:hralign="center" o:hrstd="t" o:hr="t" fillcolor="#a0a0a0" stroked="f"/>
         </w:pict>
       </w:r>
     </w:p>
@@ -8749,6 +8851,9 @@
     </w:p>
     <w:p>
       <w:r>
+        <w:rPr>
+          <w:noProof/>
+        </w:rPr>
         <w:drawing>
           <wp:inline distT="0" distB="0" distL="0" distR="0" wp14:anchorId="7A5857A7" wp14:editId="522B71DC">
             <wp:extent cx="1219200" cy="1219200"/>
@@ -8799,6 +8904,9 @@
         </w:drawing>
       </w:r>
       <w:r>
+        <w:rPr>
+          <w:noProof/>
+        </w:rPr>
         <w:drawing>
           <wp:inline distT="0" distB="0" distL="0" distR="0" wp14:anchorId="2A2798E1" wp14:editId="30DC5004">
             <wp:extent cx="1219200" cy="1219200"/>
@@ -8849,6 +8957,9 @@
         </w:drawing>
       </w:r>
       <w:r>
+        <w:rPr>
+          <w:noProof/>
+        </w:rPr>
         <w:drawing>
           <wp:inline distT="0" distB="0" distL="0" distR="0" wp14:anchorId="4C20C947" wp14:editId="48A0D57E">
             <wp:extent cx="1219200" cy="1219200"/>
@@ -8922,6 +9033,9 @@
     </w:p>
     <w:p>
       <w:r>
+        <w:rPr>
+          <w:noProof/>
+        </w:rPr>
         <w:drawing>
           <wp:inline distT="0" distB="0" distL="0" distR="0" wp14:anchorId="20D684F5" wp14:editId="7FC42AC1">
             <wp:extent cx="1219200" cy="1219200"/>
@@ -9019,6 +9133,9 @@
     </w:p>
     <w:p>
       <w:r>
+        <w:rPr>
+          <w:noProof/>
+        </w:rPr>
         <w:drawing>
           <wp:inline distT="0" distB="0" distL="0" distR="0" wp14:anchorId="60B76E83" wp14:editId="7D243B23">
             <wp:extent cx="1219200" cy="1219200"/>
@@ -9116,6 +9233,9 @@
     </w:p>
     <w:p>
       <w:r>
+        <w:rPr>
+          <w:noProof/>
+        </w:rPr>
         <w:lastRenderedPageBreak/>
         <w:drawing>
           <wp:inline distT="0" distB="0" distL="0" distR="0" wp14:anchorId="78178AAD" wp14:editId="37CA6A08">
@@ -9169,6 +9289,9 @@
     </w:p>
     <w:p>
       <w:r>
+        <w:rPr>
+          <w:noProof/>
+        </w:rPr>
         <w:drawing>
           <wp:inline distT="0" distB="0" distL="0" distR="0" wp14:anchorId="3A300F0D" wp14:editId="2DF64398">
             <wp:extent cx="1219200" cy="1219200"/>
@@ -9740,6 +9863,9 @@
     </w:p>
     <w:p>
       <w:r>
+        <w:rPr>
+          <w:noProof/>
+        </w:rPr>
         <w:lastRenderedPageBreak/>
         <w:drawing>
           <wp:inline distT="0" distB="0" distL="0" distR="0" wp14:anchorId="60BE3778" wp14:editId="32DAEA50">
@@ -9791,6 +9917,9 @@
         </w:drawing>
       </w:r>
       <w:r>
+        <w:rPr>
+          <w:noProof/>
+        </w:rPr>
         <w:drawing>
           <wp:inline distT="0" distB="0" distL="0" distR="0" wp14:anchorId="7C62D6F3" wp14:editId="421411CE">
             <wp:extent cx="304800" cy="304800"/>
@@ -9841,6 +9970,9 @@
         </w:drawing>
       </w:r>
       <w:r>
+        <w:rPr>
+          <w:noProof/>
+        </w:rPr>
         <w:drawing>
           <wp:inline distT="0" distB="0" distL="0" distR="0" wp14:anchorId="76DD18BE" wp14:editId="099E41E6">
             <wp:extent cx="861060" cy="861060"/>
@@ -9922,6 +10054,9 @@
     </w:p>
     <w:p>
       <w:r>
+        <w:rPr>
+          <w:noProof/>
+        </w:rPr>
         <w:drawing>
           <wp:inline distT="0" distB="0" distL="0" distR="0" wp14:anchorId="1B0B2397" wp14:editId="1FED121F">
             <wp:extent cx="1219200" cy="1219200"/>
@@ -10003,6 +10138,9 @@
     </w:p>
     <w:p>
       <w:r>
+        <w:rPr>
+          <w:noProof/>
+        </w:rPr>
         <w:drawing>
           <wp:inline distT="0" distB="0" distL="0" distR="0" wp14:anchorId="1561275B" wp14:editId="77D90B29">
             <wp:extent cx="1219200" cy="1219200"/>
@@ -10084,6 +10222,9 @@
     </w:p>
     <w:p>
       <w:r>
+        <w:rPr>
+          <w:noProof/>
+        </w:rPr>
         <w:drawing>
           <wp:inline distT="0" distB="0" distL="0" distR="0" wp14:anchorId="4B2F9D2F" wp14:editId="231AF0CC">
             <wp:extent cx="304800" cy="304800"/>
@@ -10284,7 +10425,7 @@
     <w:p>
       <w:r>
         <w:pict w14:anchorId="7CADE6B7">
-          <v:rect id="_x0000_i1449" style="width:0;height:1.5pt" o:hralign="center" o:hrstd="t" o:hr="t" fillcolor="#a0a0a0" stroked="f"/>
+          <v:rect id="_x0000_i1033" style="width:0;height:1.5pt" o:hralign="center" o:hrstd="t" o:hr="t" fillcolor="#a0a0a0" stroked="f"/>
         </w:pict>
       </w:r>
     </w:p>
@@ -10456,7 +10597,7 @@
     <w:p>
       <w:r>
         <w:pict w14:anchorId="36790819">
-          <v:rect id="_x0000_i1450" style="width:0;height:1.5pt" o:hralign="center" o:hrstd="t" o:hr="t" fillcolor="#a0a0a0" stroked="f"/>
+          <v:rect id="_x0000_i1034" style="width:0;height:1.5pt" o:hralign="center" o:hrstd="t" o:hr="t" fillcolor="#a0a0a0" stroked="f"/>
         </w:pict>
       </w:r>
     </w:p>
@@ -10566,7 +10707,7 @@
     <w:p>
       <w:r>
         <w:pict w14:anchorId="5C38663F">
-          <v:rect id="_x0000_i1451" style="width:0;height:1.5pt" o:hralign="center" o:hrstd="t" o:hr="t" fillcolor="#a0a0a0" stroked="f"/>
+          <v:rect id="_x0000_i1035" style="width:0;height:1.5pt" o:hralign="center" o:hrstd="t" o:hr="t" fillcolor="#a0a0a0" stroked="f"/>
         </w:pict>
       </w:r>
     </w:p>
@@ -10691,6 +10832,9 @@
     </w:p>
     <w:p>
       <w:r>
+        <w:rPr>
+          <w:noProof/>
+        </w:rPr>
         <w:lastRenderedPageBreak/>
         <w:drawing>
           <wp:inline distT="0" distB="0" distL="0" distR="0" wp14:anchorId="7AB75D71" wp14:editId="1497B4D0">
@@ -10742,6 +10886,9 @@
         </w:drawing>
       </w:r>
       <w:r>
+        <w:rPr>
+          <w:noProof/>
+        </w:rPr>
         <w:drawing>
           <wp:inline distT="0" distB="0" distL="0" distR="0" wp14:anchorId="6788C118" wp14:editId="3C94A40C">
             <wp:extent cx="1219200" cy="1219200"/>
@@ -10792,6 +10939,9 @@
         </w:drawing>
       </w:r>
       <w:r>
+        <w:rPr>
+          <w:noProof/>
+        </w:rPr>
         <mc:AlternateContent>
           <mc:Choice Requires="wps">
             <w:drawing>
@@ -10891,6 +11041,9 @@
     </w:p>
     <w:p>
       <w:r>
+        <w:rPr>
+          <w:noProof/>
+        </w:rPr>
         <w:drawing>
           <wp:inline distT="0" distB="0" distL="0" distR="0" wp14:anchorId="222BE3E1" wp14:editId="6C77E923">
             <wp:extent cx="3025140" cy="1516380"/>
@@ -10943,6 +11096,9 @@
     </w:p>
     <w:p>
       <w:r>
+        <w:rPr>
+          <w:noProof/>
+        </w:rPr>
         <w:drawing>
           <wp:inline distT="0" distB="0" distL="0" distR="0" wp14:anchorId="08D1FEB1" wp14:editId="312BBE25">
             <wp:extent cx="1219200" cy="1219200"/>
@@ -11023,6 +11179,9 @@
     </w:p>
     <w:p>
       <w:r>
+        <w:rPr>
+          <w:noProof/>
+        </w:rPr>
         <w:lastRenderedPageBreak/>
         <w:drawing>
           <wp:inline distT="0" distB="0" distL="0" distR="0" wp14:anchorId="7B247881" wp14:editId="0E6D95FE">
@@ -11076,6 +11235,9 @@
     </w:p>
     <w:p>
       <w:r>
+        <w:rPr>
+          <w:noProof/>
+        </w:rPr>
         <w:drawing>
           <wp:inline distT="0" distB="0" distL="0" distR="0" wp14:anchorId="412FF382" wp14:editId="4AE4D6A4">
             <wp:extent cx="1219200" cy="1219200"/>
@@ -11165,6 +11327,9 @@
     </w:p>
     <w:p>
       <w:r>
+        <w:rPr>
+          <w:noProof/>
+        </w:rPr>
         <mc:AlternateContent>
           <mc:Choice Requires="wps">
             <w:drawing>
@@ -11882,25 +12047,7 @@
           <w:sz w:val="28"/>
           <w:szCs w:val="28"/>
         </w:rPr>
-        <w:t>(</w:t>
-      </w:r>
-      <w:r>
-        <w:rPr>
-          <w:b/>
-          <w:bCs/>
-          <w:sz w:val="28"/>
-          <w:szCs w:val="28"/>
-        </w:rPr>
-        <w:t>Encoding vs Conversion vs Decoding in buffer from</w:t>
-      </w:r>
-      <w:r>
-        <w:rPr>
-          <w:b/>
-          <w:bCs/>
-          <w:sz w:val="28"/>
-          <w:szCs w:val="28"/>
-        </w:rPr>
-        <w:t xml:space="preserve"> – google -ss)</w:t>
+        <w:t>(Encoding vs Conversion vs Decoding in buffer from – google -ss)</w:t>
       </w:r>
     </w:p>
     <w:p>
@@ -13268,6 +13415,1371 @@
           <w:szCs w:val="28"/>
         </w:rPr>
         <w:t>, I can write the exact code you need.</w:t>
+      </w:r>
+    </w:p>
+    <w:p>
+      <w:pPr>
+        <w:pBdr>
+          <w:bottom w:val="dotted" w:sz="24" w:space="1" w:color="auto"/>
+        </w:pBdr>
+        <w:rPr>
+          <w:sz w:val="28"/>
+          <w:szCs w:val="28"/>
+        </w:rPr>
+      </w:pPr>
+    </w:p>
+    <w:p>
+      <w:pPr>
+        <w:jc w:val="center"/>
+        <w:rPr>
+          <w:b/>
+          <w:bCs/>
+          <w:color w:val="FF0000"/>
+          <w:sz w:val="28"/>
+          <w:szCs w:val="28"/>
+        </w:rPr>
+      </w:pPr>
+      <w:r>
+        <w:rPr>
+          <w:b/>
+          <w:bCs/>
+          <w:color w:val="FF0000"/>
+          <w:sz w:val="28"/>
+          <w:szCs w:val="28"/>
+        </w:rPr>
+        <w:t xml:space="preserve">- how to find out </w:t>
+      </w:r>
+      <w:proofErr w:type="gramStart"/>
+      <w:r>
+        <w:rPr>
+          <w:b/>
+          <w:bCs/>
+          <w:color w:val="FF0000"/>
+          <w:sz w:val="28"/>
+          <w:szCs w:val="28"/>
+        </w:rPr>
+        <w:t>what is</w:t>
+      </w:r>
+      <w:proofErr w:type="gramEnd"/>
+      <w:r>
+        <w:rPr>
+          <w:b/>
+          <w:bCs/>
+          <w:color w:val="FF0000"/>
+          <w:sz w:val="28"/>
+          <w:szCs w:val="28"/>
+        </w:rPr>
+        <w:t xml:space="preserve"> base64 format of a string in buffer?</w:t>
+      </w:r>
+    </w:p>
+    <w:p>
+      <w:pPr>
+        <w:jc w:val="center"/>
+        <w:rPr>
+          <w:b/>
+          <w:bCs/>
+          <w:color w:val="FF0000"/>
+          <w:sz w:val="28"/>
+          <w:szCs w:val="28"/>
+        </w:rPr>
+      </w:pPr>
+      <w:proofErr w:type="gramStart"/>
+      <w:r>
+        <w:rPr>
+          <w:b/>
+          <w:bCs/>
+          <w:color w:val="FF0000"/>
+          <w:sz w:val="28"/>
+          <w:szCs w:val="28"/>
+        </w:rPr>
+        <w:t>( how</w:t>
+      </w:r>
+      <w:proofErr w:type="gramEnd"/>
+      <w:r>
+        <w:rPr>
+          <w:b/>
+          <w:bCs/>
+          <w:color w:val="FF0000"/>
+          <w:sz w:val="28"/>
+          <w:szCs w:val="28"/>
+        </w:rPr>
+        <w:t xml:space="preserve"> to find out what is base64 format of a string in buffer - google - ss)</w:t>
+      </w:r>
+    </w:p>
+    <w:p>
+      <w:pPr>
+        <w:rPr>
+          <w:sz w:val="28"/>
+          <w:szCs w:val="28"/>
+        </w:rPr>
+      </w:pPr>
+      <w:r>
+        <w:rPr>
+          <w:sz w:val="28"/>
+          <w:szCs w:val="28"/>
+        </w:rPr>
+        <w:t>To find out the Base64 format of a string stored inside a buffer, you must convert the buffer's binary contents using the specific programming language's buffer utilities. [</w:t>
+      </w:r>
+      <w:hyperlink r:id="rId182" w:history="1">
+        <w:r>
+          <w:rPr>
+            <w:rStyle w:val="Hyperlink"/>
+            <w:sz w:val="28"/>
+            <w:szCs w:val="28"/>
+          </w:rPr>
+          <w:t>1</w:t>
+        </w:r>
+      </w:hyperlink>
+      <w:r>
+        <w:rPr>
+          <w:sz w:val="28"/>
+          <w:szCs w:val="28"/>
+        </w:rPr>
+        <w:t>]</w:t>
+      </w:r>
+    </w:p>
+    <w:p>
+      <w:pPr>
+        <w:rPr>
+          <w:sz w:val="28"/>
+          <w:szCs w:val="28"/>
+        </w:rPr>
+      </w:pPr>
+      <w:r>
+        <w:rPr>
+          <w:sz w:val="28"/>
+          <w:szCs w:val="28"/>
+        </w:rPr>
+        <w:t>The exact implementation depends on the language or runtime environment you are using:</w:t>
+      </w:r>
+    </w:p>
+    <w:p>
+      <w:pPr>
+        <w:rPr>
+          <w:b/>
+          <w:bCs/>
+          <w:sz w:val="28"/>
+          <w:szCs w:val="28"/>
+        </w:rPr>
+      </w:pPr>
+      <w:r>
+        <w:rPr>
+          <w:b/>
+          <w:bCs/>
+          <w:sz w:val="28"/>
+          <w:szCs w:val="28"/>
+        </w:rPr>
+        <w:t>Node.js (JavaScript)</w:t>
+      </w:r>
+    </w:p>
+    <w:p>
+      <w:pPr>
+        <w:rPr>
+          <w:sz w:val="28"/>
+          <w:szCs w:val="28"/>
+        </w:rPr>
+      </w:pPr>
+      <w:r>
+        <w:rPr>
+          <w:sz w:val="28"/>
+          <w:szCs w:val="28"/>
+        </w:rPr>
+        <w:t xml:space="preserve">In Node.js, you call </w:t>
+      </w:r>
+      <w:proofErr w:type="gramStart"/>
+      <w:r>
+        <w:rPr>
+          <w:sz w:val="28"/>
+          <w:szCs w:val="28"/>
+        </w:rPr>
+        <w:t>the .</w:t>
+      </w:r>
+      <w:proofErr w:type="spellStart"/>
+      <w:r>
+        <w:rPr>
+          <w:sz w:val="28"/>
+          <w:szCs w:val="28"/>
+        </w:rPr>
+        <w:t>toString</w:t>
+      </w:r>
+      <w:proofErr w:type="spellEnd"/>
+      <w:proofErr w:type="gramEnd"/>
+      <w:r>
+        <w:rPr>
+          <w:sz w:val="28"/>
+          <w:szCs w:val="28"/>
+        </w:rPr>
+        <w:t xml:space="preserve">() method on your </w:t>
+      </w:r>
+      <w:hyperlink r:id="rId183" w:tgtFrame="_blank" w:history="1">
+        <w:r>
+          <w:rPr>
+            <w:rStyle w:val="Hyperlink"/>
+            <w:sz w:val="28"/>
+            <w:szCs w:val="28"/>
+          </w:rPr>
+          <w:t>Node.js Buffer object</w:t>
+        </w:r>
+      </w:hyperlink>
+      <w:r>
+        <w:rPr>
+          <w:sz w:val="28"/>
+          <w:szCs w:val="28"/>
+        </w:rPr>
+        <w:t xml:space="preserve"> and explicitly pass 'base64' or 'base64url' as the argument. [</w:t>
+      </w:r>
+      <w:hyperlink r:id="rId184" w:history="1">
+        <w:r>
+          <w:rPr>
+            <w:rStyle w:val="Hyperlink"/>
+            <w:sz w:val="28"/>
+            <w:szCs w:val="28"/>
+          </w:rPr>
+          <w:t>1</w:t>
+        </w:r>
+      </w:hyperlink>
+      <w:r>
+        <w:rPr>
+          <w:sz w:val="28"/>
+          <w:szCs w:val="28"/>
+        </w:rPr>
+        <w:t xml:space="preserve">, </w:t>
+      </w:r>
+      <w:hyperlink r:id="rId185" w:history="1">
+        <w:r>
+          <w:rPr>
+            <w:rStyle w:val="Hyperlink"/>
+            <w:sz w:val="28"/>
+            <w:szCs w:val="28"/>
+          </w:rPr>
+          <w:t>2</w:t>
+        </w:r>
+      </w:hyperlink>
+      <w:r>
+        <w:rPr>
+          <w:sz w:val="28"/>
+          <w:szCs w:val="28"/>
+        </w:rPr>
+        <w:t>]</w:t>
+      </w:r>
+    </w:p>
+    <w:p>
+      <w:pPr>
+        <w:rPr>
+          <w:sz w:val="28"/>
+          <w:szCs w:val="28"/>
+        </w:rPr>
+      </w:pPr>
+      <w:proofErr w:type="spellStart"/>
+      <w:r>
+        <w:rPr>
+          <w:sz w:val="28"/>
+          <w:szCs w:val="28"/>
+        </w:rPr>
+        <w:t>javascript</w:t>
+      </w:r>
+      <w:proofErr w:type="spellEnd"/>
+    </w:p>
+    <w:p>
+      <w:pPr>
+        <w:rPr>
+          <w:sz w:val="28"/>
+          <w:szCs w:val="28"/>
+        </w:rPr>
+      </w:pPr>
+      <w:r>
+        <w:rPr>
+          <w:sz w:val="28"/>
+          <w:szCs w:val="28"/>
+        </w:rPr>
+        <w:t>// 1. Create a buffer containing a string (defaults to utf8)</w:t>
+      </w:r>
+    </w:p>
+    <w:p>
+      <w:pPr>
+        <w:rPr>
+          <w:sz w:val="28"/>
+          <w:szCs w:val="28"/>
+        </w:rPr>
+      </w:pPr>
+      <w:r>
+        <w:rPr>
+          <w:sz w:val="28"/>
+          <w:szCs w:val="28"/>
+        </w:rPr>
+        <w:t xml:space="preserve">const </w:t>
+      </w:r>
+      <w:proofErr w:type="spellStart"/>
+      <w:r>
+        <w:rPr>
+          <w:sz w:val="28"/>
+          <w:szCs w:val="28"/>
+        </w:rPr>
+        <w:t>myBuffer</w:t>
+      </w:r>
+      <w:proofErr w:type="spellEnd"/>
+      <w:r>
+        <w:rPr>
+          <w:sz w:val="28"/>
+          <w:szCs w:val="28"/>
+        </w:rPr>
+        <w:t xml:space="preserve"> = </w:t>
+      </w:r>
+      <w:proofErr w:type="spellStart"/>
+      <w:r>
+        <w:rPr>
+          <w:sz w:val="28"/>
+          <w:szCs w:val="28"/>
+        </w:rPr>
+        <w:t>Buffer.from</w:t>
+      </w:r>
+      <w:proofErr w:type="spellEnd"/>
+      <w:r>
+        <w:rPr>
+          <w:sz w:val="28"/>
+          <w:szCs w:val="28"/>
+        </w:rPr>
+        <w:t>("Hello World");</w:t>
+      </w:r>
+    </w:p>
+    <w:p>
+      <w:pPr>
+        <w:rPr>
+          <w:sz w:val="28"/>
+          <w:szCs w:val="28"/>
+        </w:rPr>
+      </w:pPr>
+    </w:p>
+    <w:p>
+      <w:pPr>
+        <w:rPr>
+          <w:sz w:val="28"/>
+          <w:szCs w:val="28"/>
+        </w:rPr>
+      </w:pPr>
+      <w:r>
+        <w:rPr>
+          <w:sz w:val="28"/>
+          <w:szCs w:val="28"/>
+        </w:rPr>
+        <w:t>// 2. Extract the standard Base64 format string</w:t>
+      </w:r>
+    </w:p>
+    <w:p>
+      <w:pPr>
+        <w:rPr>
+          <w:sz w:val="28"/>
+          <w:szCs w:val="28"/>
+        </w:rPr>
+      </w:pPr>
+      <w:r>
+        <w:rPr>
+          <w:sz w:val="28"/>
+          <w:szCs w:val="28"/>
+        </w:rPr>
+        <w:t xml:space="preserve">const standardBase64 = </w:t>
+      </w:r>
+      <w:proofErr w:type="spellStart"/>
+      <w:r>
+        <w:rPr>
+          <w:sz w:val="28"/>
+          <w:szCs w:val="28"/>
+        </w:rPr>
+        <w:t>myBuffer.toString</w:t>
+      </w:r>
+      <w:proofErr w:type="spellEnd"/>
+      <w:r>
+        <w:rPr>
+          <w:sz w:val="28"/>
+          <w:szCs w:val="28"/>
+        </w:rPr>
+        <w:t xml:space="preserve">("base64"); </w:t>
+      </w:r>
+    </w:p>
+    <w:p>
+      <w:pPr>
+        <w:rPr>
+          <w:sz w:val="28"/>
+          <w:szCs w:val="28"/>
+        </w:rPr>
+      </w:pPr>
+      <w:r>
+        <w:rPr>
+          <w:sz w:val="28"/>
+          <w:szCs w:val="28"/>
+        </w:rPr>
+        <w:t>console.log(standardBase64); // Output: SGVsbG8gV29ybGQ=</w:t>
+      </w:r>
+    </w:p>
+    <w:p>
+      <w:pPr>
+        <w:rPr>
+          <w:sz w:val="28"/>
+          <w:szCs w:val="28"/>
+        </w:rPr>
+      </w:pPr>
+    </w:p>
+    <w:p>
+      <w:pPr>
+        <w:rPr>
+          <w:sz w:val="28"/>
+          <w:szCs w:val="28"/>
+        </w:rPr>
+      </w:pPr>
+      <w:r>
+        <w:rPr>
+          <w:sz w:val="28"/>
+          <w:szCs w:val="28"/>
+        </w:rPr>
+        <w:t>// 3. Extract the URL-safe Base64 format string (omits padding and swaps +/- characters)</w:t>
+      </w:r>
+    </w:p>
+    <w:p>
+      <w:pPr>
+        <w:rPr>
+          <w:sz w:val="28"/>
+          <w:szCs w:val="28"/>
+        </w:rPr>
+      </w:pPr>
+      <w:r>
+        <w:rPr>
+          <w:sz w:val="28"/>
+          <w:szCs w:val="28"/>
+        </w:rPr>
+        <w:lastRenderedPageBreak/>
+        <w:t xml:space="preserve">const urlSafeBase64 = </w:t>
+      </w:r>
+      <w:proofErr w:type="spellStart"/>
+      <w:r>
+        <w:rPr>
+          <w:sz w:val="28"/>
+          <w:szCs w:val="28"/>
+        </w:rPr>
+        <w:t>myBuffer.toString</w:t>
+      </w:r>
+      <w:proofErr w:type="spellEnd"/>
+      <w:r>
+        <w:rPr>
+          <w:sz w:val="28"/>
+          <w:szCs w:val="28"/>
+        </w:rPr>
+        <w:t xml:space="preserve">("base64url"); </w:t>
+      </w:r>
+    </w:p>
+    <w:p>
+      <w:pPr>
+        <w:rPr>
+          <w:sz w:val="28"/>
+          <w:szCs w:val="28"/>
+        </w:rPr>
+      </w:pPr>
+      <w:r>
+        <w:rPr>
+          <w:sz w:val="28"/>
+          <w:szCs w:val="28"/>
+        </w:rPr>
+        <w:t>console.log(urlSafeBase64); // Output: SGVsbG8gV29ybGQ</w:t>
+      </w:r>
+    </w:p>
+    <w:p>
+      <w:pPr>
+        <w:rPr>
+          <w:sz w:val="28"/>
+          <w:szCs w:val="28"/>
+        </w:rPr>
+      </w:pPr>
+      <w:r>
+        <w:rPr>
+          <w:sz w:val="28"/>
+          <w:szCs w:val="28"/>
+        </w:rPr>
+        <w:t>Use code with caution.</w:t>
+      </w:r>
+    </w:p>
+    <w:p>
+      <w:pPr>
+        <w:rPr>
+          <w:b/>
+          <w:bCs/>
+          <w:sz w:val="28"/>
+          <w:szCs w:val="28"/>
+        </w:rPr>
+      </w:pPr>
+      <w:r>
+        <w:rPr>
+          <w:b/>
+          <w:bCs/>
+          <w:sz w:val="28"/>
+          <w:szCs w:val="28"/>
+        </w:rPr>
+        <w:t>Python</w:t>
+      </w:r>
+    </w:p>
+    <w:p>
+      <w:pPr>
+        <w:rPr>
+          <w:sz w:val="28"/>
+          <w:szCs w:val="28"/>
+        </w:rPr>
+      </w:pPr>
+      <w:r>
+        <w:rPr>
+          <w:sz w:val="28"/>
+          <w:szCs w:val="28"/>
+        </w:rPr>
+        <w:t xml:space="preserve">Python handles buffers natively through bytes or </w:t>
+      </w:r>
+      <w:proofErr w:type="spellStart"/>
+      <w:r>
+        <w:rPr>
+          <w:sz w:val="28"/>
+          <w:szCs w:val="28"/>
+        </w:rPr>
+        <w:t>bytearray</w:t>
+      </w:r>
+      <w:proofErr w:type="spellEnd"/>
+      <w:r>
+        <w:rPr>
+          <w:sz w:val="28"/>
+          <w:szCs w:val="28"/>
+        </w:rPr>
+        <w:t xml:space="preserve"> structures. You use the built-in </w:t>
+      </w:r>
+      <w:hyperlink r:id="rId186" w:tgtFrame="_blank" w:history="1">
+        <w:r>
+          <w:rPr>
+            <w:rStyle w:val="Hyperlink"/>
+            <w:sz w:val="28"/>
+            <w:szCs w:val="28"/>
+          </w:rPr>
+          <w:t>Python base64 module</w:t>
+        </w:r>
+      </w:hyperlink>
+      <w:r>
+        <w:rPr>
+          <w:sz w:val="28"/>
+          <w:szCs w:val="28"/>
+        </w:rPr>
+        <w:t xml:space="preserve"> to encode the buffer data and decode it to an ASCII string. [</w:t>
+      </w:r>
+      <w:hyperlink r:id="rId187" w:history="1">
+        <w:r>
+          <w:rPr>
+            <w:rStyle w:val="Hyperlink"/>
+            <w:sz w:val="28"/>
+            <w:szCs w:val="28"/>
+          </w:rPr>
+          <w:t>1</w:t>
+        </w:r>
+      </w:hyperlink>
+      <w:r>
+        <w:rPr>
+          <w:sz w:val="28"/>
+          <w:szCs w:val="28"/>
+        </w:rPr>
+        <w:t xml:space="preserve">, </w:t>
+      </w:r>
+      <w:hyperlink r:id="rId188" w:history="1">
+        <w:r>
+          <w:rPr>
+            <w:rStyle w:val="Hyperlink"/>
+            <w:sz w:val="28"/>
+            <w:szCs w:val="28"/>
+          </w:rPr>
+          <w:t>2</w:t>
+        </w:r>
+      </w:hyperlink>
+      <w:r>
+        <w:rPr>
+          <w:sz w:val="28"/>
+          <w:szCs w:val="28"/>
+        </w:rPr>
+        <w:t xml:space="preserve">, </w:t>
+      </w:r>
+      <w:hyperlink r:id="rId189" w:history="1">
+        <w:r>
+          <w:rPr>
+            <w:rStyle w:val="Hyperlink"/>
+            <w:sz w:val="28"/>
+            <w:szCs w:val="28"/>
+          </w:rPr>
+          <w:t>3</w:t>
+        </w:r>
+      </w:hyperlink>
+      <w:r>
+        <w:rPr>
+          <w:sz w:val="28"/>
+          <w:szCs w:val="28"/>
+        </w:rPr>
+        <w:t xml:space="preserve">, </w:t>
+      </w:r>
+      <w:hyperlink r:id="rId190" w:history="1">
+        <w:r>
+          <w:rPr>
+            <w:rStyle w:val="Hyperlink"/>
+            <w:sz w:val="28"/>
+            <w:szCs w:val="28"/>
+          </w:rPr>
+          <w:t>4</w:t>
+        </w:r>
+      </w:hyperlink>
+      <w:r>
+        <w:rPr>
+          <w:sz w:val="28"/>
+          <w:szCs w:val="28"/>
+        </w:rPr>
+        <w:t>]</w:t>
+      </w:r>
+    </w:p>
+    <w:p>
+      <w:pPr>
+        <w:rPr>
+          <w:sz w:val="28"/>
+          <w:szCs w:val="28"/>
+        </w:rPr>
+      </w:pPr>
+      <w:r>
+        <w:rPr>
+          <w:sz w:val="28"/>
+          <w:szCs w:val="28"/>
+        </w:rPr>
+        <w:t>python</w:t>
+      </w:r>
+    </w:p>
+    <w:p>
+      <w:pPr>
+        <w:rPr>
+          <w:sz w:val="28"/>
+          <w:szCs w:val="28"/>
+        </w:rPr>
+      </w:pPr>
+      <w:r>
+        <w:rPr>
+          <w:sz w:val="28"/>
+          <w:szCs w:val="28"/>
+        </w:rPr>
+        <w:t>import base64</w:t>
+      </w:r>
+    </w:p>
+    <w:p>
+      <w:pPr>
+        <w:rPr>
+          <w:sz w:val="28"/>
+          <w:szCs w:val="28"/>
+        </w:rPr>
+      </w:pPr>
+    </w:p>
+    <w:p>
+      <w:pPr>
+        <w:rPr>
+          <w:sz w:val="28"/>
+          <w:szCs w:val="28"/>
+        </w:rPr>
+      </w:pPr>
+      <w:r>
+        <w:rPr>
+          <w:sz w:val="28"/>
+          <w:szCs w:val="28"/>
+        </w:rPr>
+        <w:t xml:space="preserve"># 1. Create a </w:t>
+      </w:r>
+      <w:proofErr w:type="gramStart"/>
+      <w:r>
+        <w:rPr>
+          <w:sz w:val="28"/>
+          <w:szCs w:val="28"/>
+        </w:rPr>
+        <w:t>bytes</w:t>
+      </w:r>
+      <w:proofErr w:type="gramEnd"/>
+      <w:r>
+        <w:rPr>
+          <w:sz w:val="28"/>
+          <w:szCs w:val="28"/>
+        </w:rPr>
+        <w:t xml:space="preserve"> buffer from a string</w:t>
+      </w:r>
+    </w:p>
+    <w:p>
+      <w:pPr>
+        <w:rPr>
+          <w:sz w:val="28"/>
+          <w:szCs w:val="28"/>
+        </w:rPr>
+      </w:pPr>
+      <w:proofErr w:type="spellStart"/>
+      <w:r>
+        <w:rPr>
+          <w:sz w:val="28"/>
+          <w:szCs w:val="28"/>
+        </w:rPr>
+        <w:t>my_buffer</w:t>
+      </w:r>
+      <w:proofErr w:type="spellEnd"/>
+      <w:r>
+        <w:rPr>
+          <w:sz w:val="28"/>
+          <w:szCs w:val="28"/>
+        </w:rPr>
+        <w:t xml:space="preserve"> = </w:t>
+      </w:r>
+      <w:proofErr w:type="spellStart"/>
+      <w:r>
+        <w:rPr>
+          <w:sz w:val="28"/>
+          <w:szCs w:val="28"/>
+        </w:rPr>
+        <w:t>b"Hello</w:t>
+      </w:r>
+      <w:proofErr w:type="spellEnd"/>
+      <w:r>
+        <w:rPr>
+          <w:sz w:val="28"/>
+          <w:szCs w:val="28"/>
+        </w:rPr>
+        <w:t xml:space="preserve"> World"</w:t>
+      </w:r>
+    </w:p>
+    <w:p>
+      <w:pPr>
+        <w:rPr>
+          <w:sz w:val="28"/>
+          <w:szCs w:val="28"/>
+        </w:rPr>
+      </w:pPr>
+    </w:p>
+    <w:p>
+      <w:pPr>
+        <w:rPr>
+          <w:sz w:val="28"/>
+          <w:szCs w:val="28"/>
+        </w:rPr>
+      </w:pPr>
+      <w:r>
+        <w:rPr>
+          <w:sz w:val="28"/>
+          <w:szCs w:val="28"/>
+        </w:rPr>
+        <w:t># 2. Get the standard Base64 format string</w:t>
+      </w:r>
+    </w:p>
+    <w:p>
+      <w:pPr>
+        <w:rPr>
+          <w:sz w:val="28"/>
+          <w:szCs w:val="28"/>
+        </w:rPr>
+      </w:pPr>
+      <w:r>
+        <w:rPr>
+          <w:sz w:val="28"/>
+          <w:szCs w:val="28"/>
+        </w:rPr>
+        <w:t>base64_bytes = base64.b64encode(</w:t>
+      </w:r>
+      <w:proofErr w:type="spellStart"/>
+      <w:r>
+        <w:rPr>
+          <w:sz w:val="28"/>
+          <w:szCs w:val="28"/>
+        </w:rPr>
+        <w:t>my_buffer</w:t>
+      </w:r>
+      <w:proofErr w:type="spellEnd"/>
+      <w:r>
+        <w:rPr>
+          <w:sz w:val="28"/>
+          <w:szCs w:val="28"/>
+        </w:rPr>
+        <w:t>)</w:t>
+      </w:r>
+    </w:p>
+    <w:p>
+      <w:pPr>
+        <w:rPr>
+          <w:sz w:val="28"/>
+          <w:szCs w:val="28"/>
+        </w:rPr>
+      </w:pPr>
+      <w:r>
+        <w:rPr>
+          <w:sz w:val="28"/>
+          <w:szCs w:val="28"/>
+        </w:rPr>
+        <w:t>base64_string = base64_</w:t>
+      </w:r>
+      <w:proofErr w:type="gramStart"/>
+      <w:r>
+        <w:rPr>
+          <w:sz w:val="28"/>
+          <w:szCs w:val="28"/>
+        </w:rPr>
+        <w:t>bytes.decode</w:t>
+      </w:r>
+      <w:proofErr w:type="gramEnd"/>
+      <w:r>
+        <w:rPr>
+          <w:sz w:val="28"/>
+          <w:szCs w:val="28"/>
+        </w:rPr>
+        <w:t>("utf-8")</w:t>
+      </w:r>
+    </w:p>
+    <w:p>
+      <w:pPr>
+        <w:rPr>
+          <w:sz w:val="28"/>
+          <w:szCs w:val="28"/>
+        </w:rPr>
+      </w:pPr>
+      <w:r>
+        <w:rPr>
+          <w:sz w:val="28"/>
+          <w:szCs w:val="28"/>
+        </w:rPr>
+        <w:t>print(base64_</w:t>
+      </w:r>
+      <w:proofErr w:type="gramStart"/>
+      <w:r>
+        <w:rPr>
+          <w:sz w:val="28"/>
+          <w:szCs w:val="28"/>
+        </w:rPr>
+        <w:t>string)  #</w:t>
+      </w:r>
+      <w:proofErr w:type="gramEnd"/>
+      <w:r>
+        <w:rPr>
+          <w:sz w:val="28"/>
+          <w:szCs w:val="28"/>
+        </w:rPr>
+        <w:t xml:space="preserve"> Output: SGVsbG8gV29ybGQ=</w:t>
+      </w:r>
+    </w:p>
+    <w:p>
+      <w:pPr>
+        <w:rPr>
+          <w:sz w:val="28"/>
+          <w:szCs w:val="28"/>
+        </w:rPr>
+      </w:pPr>
+      <w:r>
+        <w:rPr>
+          <w:sz w:val="28"/>
+          <w:szCs w:val="28"/>
+        </w:rPr>
+        <w:t>Use code with caution.</w:t>
+      </w:r>
+    </w:p>
+    <w:p>
+      <w:pPr>
+        <w:rPr>
+          <w:b/>
+          <w:bCs/>
+          <w:sz w:val="28"/>
+          <w:szCs w:val="28"/>
+        </w:rPr>
+      </w:pPr>
+      <w:r>
+        <w:rPr>
+          <w:b/>
+          <w:bCs/>
+          <w:sz w:val="28"/>
+          <w:szCs w:val="28"/>
+        </w:rPr>
+        <w:t>.NET (C#)</w:t>
+      </w:r>
+    </w:p>
+    <w:p>
+      <w:pPr>
+        <w:rPr>
+          <w:sz w:val="28"/>
+          <w:szCs w:val="28"/>
+        </w:rPr>
+      </w:pPr>
+      <w:r>
+        <w:rPr>
+          <w:sz w:val="28"/>
+          <w:szCs w:val="28"/>
+        </w:rPr>
+        <w:t xml:space="preserve">In modern C#, you can validate or convert the contents of a buffer (like a </w:t>
+      </w:r>
+      <w:proofErr w:type="spellStart"/>
+      <w:r>
+        <w:rPr>
+          <w:sz w:val="28"/>
+          <w:szCs w:val="28"/>
+        </w:rPr>
+        <w:t>ReadOnlySpan</w:t>
+      </w:r>
+      <w:proofErr w:type="spellEnd"/>
+      <w:r>
+        <w:rPr>
+          <w:sz w:val="28"/>
+          <w:szCs w:val="28"/>
+        </w:rPr>
+        <w:t>&lt;byte&gt; or array) directly to text formats. You use the Convert.ToBase64String utility method to process the underlying array. [</w:t>
+      </w:r>
+      <w:hyperlink r:id="rId191" w:history="1">
+        <w:r>
+          <w:rPr>
+            <w:rStyle w:val="Hyperlink"/>
+            <w:sz w:val="28"/>
+            <w:szCs w:val="28"/>
+          </w:rPr>
+          <w:t>1</w:t>
+        </w:r>
+      </w:hyperlink>
+      <w:r>
+        <w:rPr>
+          <w:sz w:val="28"/>
+          <w:szCs w:val="28"/>
+        </w:rPr>
+        <w:t xml:space="preserve">, </w:t>
+      </w:r>
+      <w:hyperlink r:id="rId192" w:history="1">
+        <w:r>
+          <w:rPr>
+            <w:rStyle w:val="Hyperlink"/>
+            <w:sz w:val="28"/>
+            <w:szCs w:val="28"/>
+          </w:rPr>
+          <w:t>2</w:t>
+        </w:r>
+      </w:hyperlink>
+      <w:r>
+        <w:rPr>
+          <w:sz w:val="28"/>
+          <w:szCs w:val="28"/>
+        </w:rPr>
+        <w:t>]</w:t>
+      </w:r>
+    </w:p>
+    <w:p>
+      <w:pPr>
+        <w:rPr>
+          <w:sz w:val="28"/>
+          <w:szCs w:val="28"/>
+        </w:rPr>
+      </w:pPr>
+      <w:proofErr w:type="spellStart"/>
+      <w:r>
+        <w:rPr>
+          <w:sz w:val="28"/>
+          <w:szCs w:val="28"/>
+        </w:rPr>
+        <w:t>csharp</w:t>
+      </w:r>
+      <w:proofErr w:type="spellEnd"/>
+    </w:p>
+    <w:p>
+      <w:pPr>
+        <w:rPr>
+          <w:sz w:val="28"/>
+          <w:szCs w:val="28"/>
+        </w:rPr>
+      </w:pPr>
+      <w:r>
+        <w:rPr>
+          <w:sz w:val="28"/>
+          <w:szCs w:val="28"/>
+        </w:rPr>
+        <w:t>using System;</w:t>
+      </w:r>
+    </w:p>
+    <w:p>
+      <w:pPr>
+        <w:rPr>
+          <w:sz w:val="28"/>
+          <w:szCs w:val="28"/>
+        </w:rPr>
+      </w:pPr>
+      <w:r>
+        <w:rPr>
+          <w:sz w:val="28"/>
+          <w:szCs w:val="28"/>
+        </w:rPr>
+        <w:lastRenderedPageBreak/>
+        <w:t xml:space="preserve">using </w:t>
+      </w:r>
+      <w:proofErr w:type="spellStart"/>
+      <w:r>
+        <w:rPr>
+          <w:sz w:val="28"/>
+          <w:szCs w:val="28"/>
+        </w:rPr>
+        <w:t>System.Text</w:t>
+      </w:r>
+      <w:proofErr w:type="spellEnd"/>
+      <w:r>
+        <w:rPr>
+          <w:sz w:val="28"/>
+          <w:szCs w:val="28"/>
+        </w:rPr>
+        <w:t>;</w:t>
+      </w:r>
+    </w:p>
+    <w:p>
+      <w:pPr>
+        <w:rPr>
+          <w:sz w:val="28"/>
+          <w:szCs w:val="28"/>
+        </w:rPr>
+      </w:pPr>
+    </w:p>
+    <w:p>
+      <w:pPr>
+        <w:rPr>
+          <w:sz w:val="28"/>
+          <w:szCs w:val="28"/>
+        </w:rPr>
+      </w:pPr>
+      <w:r>
+        <w:rPr>
+          <w:sz w:val="28"/>
+          <w:szCs w:val="28"/>
+        </w:rPr>
+        <w:t>// 1. Create a byte array buffer from a string</w:t>
+      </w:r>
+    </w:p>
+    <w:p>
+      <w:pPr>
+        <w:rPr>
+          <w:sz w:val="28"/>
+          <w:szCs w:val="28"/>
+        </w:rPr>
+      </w:pPr>
+      <w:proofErr w:type="gramStart"/>
+      <w:r>
+        <w:rPr>
+          <w:sz w:val="28"/>
+          <w:szCs w:val="28"/>
+        </w:rPr>
+        <w:t>byte[</w:t>
+      </w:r>
+      <w:proofErr w:type="gramEnd"/>
+      <w:r>
+        <w:rPr>
+          <w:sz w:val="28"/>
+          <w:szCs w:val="28"/>
+        </w:rPr>
+        <w:t xml:space="preserve">] </w:t>
+      </w:r>
+      <w:proofErr w:type="spellStart"/>
+      <w:r>
+        <w:rPr>
+          <w:sz w:val="28"/>
+          <w:szCs w:val="28"/>
+        </w:rPr>
+        <w:t>myBuffer</w:t>
+      </w:r>
+      <w:proofErr w:type="spellEnd"/>
+      <w:r>
+        <w:rPr>
+          <w:sz w:val="28"/>
+          <w:szCs w:val="28"/>
+        </w:rPr>
+        <w:t xml:space="preserve"> = Encoding.UTF</w:t>
+      </w:r>
+      <w:proofErr w:type="gramStart"/>
+      <w:r>
+        <w:rPr>
+          <w:sz w:val="28"/>
+          <w:szCs w:val="28"/>
+        </w:rPr>
+        <w:t>8.GetBytes</w:t>
+      </w:r>
+      <w:proofErr w:type="gramEnd"/>
+      <w:r>
+        <w:rPr>
+          <w:sz w:val="28"/>
+          <w:szCs w:val="28"/>
+        </w:rPr>
+        <w:t>("Hello World");</w:t>
+      </w:r>
+    </w:p>
+    <w:p>
+      <w:pPr>
+        <w:rPr>
+          <w:sz w:val="28"/>
+          <w:szCs w:val="28"/>
+        </w:rPr>
+      </w:pPr>
+    </w:p>
+    <w:p>
+      <w:pPr>
+        <w:rPr>
+          <w:sz w:val="28"/>
+          <w:szCs w:val="28"/>
+        </w:rPr>
+      </w:pPr>
+      <w:r>
+        <w:rPr>
+          <w:sz w:val="28"/>
+          <w:szCs w:val="28"/>
+        </w:rPr>
+        <w:t>// 2. Get the Base64 string from the buffer</w:t>
+      </w:r>
+    </w:p>
+    <w:p>
+      <w:pPr>
+        <w:rPr>
+          <w:sz w:val="28"/>
+          <w:szCs w:val="28"/>
+        </w:rPr>
+      </w:pPr>
+      <w:r>
+        <w:rPr>
+          <w:sz w:val="28"/>
+          <w:szCs w:val="28"/>
+        </w:rPr>
+        <w:t>string base64String = Convert.ToBase64String(</w:t>
+      </w:r>
+      <w:proofErr w:type="spellStart"/>
+      <w:r>
+        <w:rPr>
+          <w:sz w:val="28"/>
+          <w:szCs w:val="28"/>
+        </w:rPr>
+        <w:t>myBuffer</w:t>
+      </w:r>
+      <w:proofErr w:type="spellEnd"/>
+      <w:r>
+        <w:rPr>
+          <w:sz w:val="28"/>
+          <w:szCs w:val="28"/>
+        </w:rPr>
+        <w:t>);</w:t>
+      </w:r>
+    </w:p>
+    <w:p>
+      <w:pPr>
+        <w:rPr>
+          <w:sz w:val="28"/>
+          <w:szCs w:val="28"/>
+        </w:rPr>
+      </w:pPr>
+      <w:proofErr w:type="spellStart"/>
+      <w:r>
+        <w:rPr>
+          <w:sz w:val="28"/>
+          <w:szCs w:val="28"/>
+        </w:rPr>
+        <w:t>Console.WriteLine</w:t>
+      </w:r>
+      <w:proofErr w:type="spellEnd"/>
+      <w:r>
+        <w:rPr>
+          <w:sz w:val="28"/>
+          <w:szCs w:val="28"/>
+        </w:rPr>
+        <w:t>(base64String); // Output: SGVsbG8gV29ybGQ=</w:t>
+      </w:r>
+    </w:p>
+    <w:p>
+      <w:pPr>
+        <w:rPr>
+          <w:sz w:val="28"/>
+          <w:szCs w:val="28"/>
+        </w:rPr>
+      </w:pPr>
+      <w:r>
+        <w:rPr>
+          <w:sz w:val="28"/>
+          <w:szCs w:val="28"/>
+        </w:rPr>
+        <w:t>Use code with caution.</w:t>
+      </w:r>
+    </w:p>
+    <w:p>
+      <w:pPr>
+        <w:rPr>
+          <w:b/>
+          <w:bCs/>
+          <w:sz w:val="28"/>
+          <w:szCs w:val="28"/>
+        </w:rPr>
+      </w:pPr>
+      <w:r>
+        <w:rPr>
+          <w:b/>
+          <w:bCs/>
+          <w:sz w:val="28"/>
+          <w:szCs w:val="28"/>
+        </w:rPr>
+        <w:t>Key Differences Between Base64 Formats</w:t>
+      </w:r>
+    </w:p>
+    <w:p>
+      <w:pPr>
+        <w:numPr>
+          <w:ilvl w:val="0"/>
+          <w:numId w:val="33"/>
+        </w:numPr>
+        <w:rPr>
+          <w:sz w:val="28"/>
+          <w:szCs w:val="28"/>
+        </w:rPr>
+      </w:pPr>
+      <w:r>
+        <w:rPr>
+          <w:b/>
+          <w:bCs/>
+          <w:sz w:val="28"/>
+          <w:szCs w:val="28"/>
+        </w:rPr>
+        <w:t>Standard Base64 (RFC 4648 §4)</w:t>
+      </w:r>
+      <w:r>
+        <w:rPr>
+          <w:sz w:val="28"/>
+          <w:szCs w:val="28"/>
+        </w:rPr>
+        <w:t>: Uses characters A-Z, a-z, 0-9, +, /, and adds = padding at the end if the binary data is not a multiple of 3 bytes.</w:t>
+      </w:r>
+    </w:p>
+    <w:p>
+      <w:pPr>
+        <w:numPr>
+          <w:ilvl w:val="0"/>
+          <w:numId w:val="33"/>
+        </w:numPr>
+        <w:rPr>
+          <w:sz w:val="28"/>
+          <w:szCs w:val="28"/>
+        </w:rPr>
+      </w:pPr>
+      <w:r>
+        <w:rPr>
+          <w:b/>
+          <w:bCs/>
+          <w:sz w:val="28"/>
+          <w:szCs w:val="28"/>
+        </w:rPr>
+        <w:t>URL-Safe Base64 (RFC 4648 §5)</w:t>
+      </w:r>
+      <w:r>
+        <w:rPr>
+          <w:sz w:val="28"/>
+          <w:szCs w:val="28"/>
+        </w:rPr>
+        <w:t>: Replaces + with - and / with _ so the string can be safely embedded in web URLs without percent-encoding. It also typically omits the trailing = padding characters. [</w:t>
+      </w:r>
+      <w:hyperlink r:id="rId193" w:history="1">
+        <w:r>
+          <w:rPr>
+            <w:rStyle w:val="Hyperlink"/>
+            <w:sz w:val="28"/>
+            <w:szCs w:val="28"/>
+          </w:rPr>
+          <w:t>1</w:t>
+        </w:r>
+      </w:hyperlink>
+      <w:r>
+        <w:rPr>
+          <w:sz w:val="28"/>
+          <w:szCs w:val="28"/>
+        </w:rPr>
+        <w:t xml:space="preserve">, </w:t>
+      </w:r>
+      <w:hyperlink r:id="rId194" w:history="1">
+        <w:r>
+          <w:rPr>
+            <w:rStyle w:val="Hyperlink"/>
+            <w:sz w:val="28"/>
+            <w:szCs w:val="28"/>
+          </w:rPr>
+          <w:t>2</w:t>
+        </w:r>
+      </w:hyperlink>
+      <w:r>
+        <w:rPr>
+          <w:sz w:val="28"/>
+          <w:szCs w:val="28"/>
+        </w:rPr>
+        <w:t xml:space="preserve">, </w:t>
+      </w:r>
+      <w:hyperlink r:id="rId195" w:history="1">
+        <w:r>
+          <w:rPr>
+            <w:rStyle w:val="Hyperlink"/>
+            <w:sz w:val="28"/>
+            <w:szCs w:val="28"/>
+          </w:rPr>
+          <w:t>3</w:t>
+        </w:r>
+      </w:hyperlink>
+      <w:r>
+        <w:rPr>
+          <w:sz w:val="28"/>
+          <w:szCs w:val="28"/>
+        </w:rPr>
+        <w:t xml:space="preserve">, </w:t>
+      </w:r>
+      <w:hyperlink r:id="rId196" w:history="1">
+        <w:r>
+          <w:rPr>
+            <w:rStyle w:val="Hyperlink"/>
+            <w:sz w:val="28"/>
+            <w:szCs w:val="28"/>
+          </w:rPr>
+          <w:t>4</w:t>
+        </w:r>
+      </w:hyperlink>
+      <w:r>
+        <w:rPr>
+          <w:sz w:val="28"/>
+          <w:szCs w:val="28"/>
+        </w:rPr>
+        <w:t xml:space="preserve">, </w:t>
+      </w:r>
+      <w:hyperlink r:id="rId197" w:history="1">
+        <w:r>
+          <w:rPr>
+            <w:rStyle w:val="Hyperlink"/>
+            <w:sz w:val="28"/>
+            <w:szCs w:val="28"/>
+          </w:rPr>
+          <w:t>5</w:t>
+        </w:r>
+      </w:hyperlink>
+      <w:r>
+        <w:rPr>
+          <w:sz w:val="28"/>
+          <w:szCs w:val="28"/>
+        </w:rPr>
+        <w:t>]</w:t>
+      </w:r>
+    </w:p>
+    <w:p>
+      <w:pPr>
+        <w:rPr>
+          <w:sz w:val="28"/>
+          <w:szCs w:val="28"/>
+        </w:rPr>
+      </w:pPr>
+      <w:r>
+        <w:rPr>
+          <w:sz w:val="28"/>
+          <w:szCs w:val="28"/>
+        </w:rPr>
+        <w:t xml:space="preserve">If you are working with a different programming language, please let me know </w:t>
+      </w:r>
+      <w:r>
+        <w:rPr>
+          <w:b/>
+          <w:bCs/>
+          <w:sz w:val="28"/>
+          <w:szCs w:val="28"/>
+        </w:rPr>
+        <w:t>which language</w:t>
+      </w:r>
+      <w:r>
+        <w:rPr>
+          <w:sz w:val="28"/>
+          <w:szCs w:val="28"/>
+        </w:rPr>
+        <w:t xml:space="preserve"> you are using so I can provide the exact code snippets.</w:t>
       </w:r>
     </w:p>
     <w:p>
@@ -17326,6 +18838,155 @@
     </w:lvl>
   </w:abstractNum>
   <w:abstractNum w:abstractNumId="28" w15:restartNumberingAfterBreak="0">
+    <w:nsid w:val="737400C4"/>
+    <w:multiLevelType w:val="multilevel"/>
+    <w:tmpl w:val="205CF53A"/>
+    <w:lvl w:ilvl="0">
+      <w:start w:val="1"/>
+      <w:numFmt w:val="bullet"/>
+      <w:lvlText w:val=""/>
+      <w:lvlJc w:val="left"/>
+      <w:pPr>
+        <w:tabs>
+          <w:tab w:val="num" w:pos="720"/>
+        </w:tabs>
+        <w:ind w:left="720" w:hanging="360"/>
+      </w:pPr>
+      <w:rPr>
+        <w:rFonts w:ascii="Symbol" w:hAnsi="Symbol" w:hint="default"/>
+        <w:sz w:val="20"/>
+      </w:rPr>
+    </w:lvl>
+    <w:lvl w:ilvl="1" w:tentative="1">
+      <w:start w:val="1"/>
+      <w:numFmt w:val="bullet"/>
+      <w:lvlText w:val="o"/>
+      <w:lvlJc w:val="left"/>
+      <w:pPr>
+        <w:tabs>
+          <w:tab w:val="num" w:pos="1440"/>
+        </w:tabs>
+        <w:ind w:left="1440" w:hanging="360"/>
+      </w:pPr>
+      <w:rPr>
+        <w:rFonts w:ascii="Courier New" w:hAnsi="Courier New" w:hint="default"/>
+        <w:sz w:val="20"/>
+      </w:rPr>
+    </w:lvl>
+    <w:lvl w:ilvl="2" w:tentative="1">
+      <w:start w:val="1"/>
+      <w:numFmt w:val="bullet"/>
+      <w:lvlText w:val=""/>
+      <w:lvlJc w:val="left"/>
+      <w:pPr>
+        <w:tabs>
+          <w:tab w:val="num" w:pos="2160"/>
+        </w:tabs>
+        <w:ind w:left="2160" w:hanging="360"/>
+      </w:pPr>
+      <w:rPr>
+        <w:rFonts w:ascii="Wingdings" w:hAnsi="Wingdings" w:hint="default"/>
+        <w:sz w:val="20"/>
+      </w:rPr>
+    </w:lvl>
+    <w:lvl w:ilvl="3" w:tentative="1">
+      <w:start w:val="1"/>
+      <w:numFmt w:val="bullet"/>
+      <w:lvlText w:val=""/>
+      <w:lvlJc w:val="left"/>
+      <w:pPr>
+        <w:tabs>
+          <w:tab w:val="num" w:pos="2880"/>
+        </w:tabs>
+        <w:ind w:left="2880" w:hanging="360"/>
+      </w:pPr>
+      <w:rPr>
+        <w:rFonts w:ascii="Wingdings" w:hAnsi="Wingdings" w:hint="default"/>
+        <w:sz w:val="20"/>
+      </w:rPr>
+    </w:lvl>
+    <w:lvl w:ilvl="4" w:tentative="1">
+      <w:start w:val="1"/>
+      <w:numFmt w:val="bullet"/>
+      <w:lvlText w:val=""/>
+      <w:lvlJc w:val="left"/>
+      <w:pPr>
+        <w:tabs>
+          <w:tab w:val="num" w:pos="3600"/>
+        </w:tabs>
+        <w:ind w:left="3600" w:hanging="360"/>
+      </w:pPr>
+      <w:rPr>
+        <w:rFonts w:ascii="Wingdings" w:hAnsi="Wingdings" w:hint="default"/>
+        <w:sz w:val="20"/>
+      </w:rPr>
+    </w:lvl>
+    <w:lvl w:ilvl="5" w:tentative="1">
+      <w:start w:val="1"/>
+      <w:numFmt w:val="bullet"/>
+      <w:lvlText w:val=""/>
+      <w:lvlJc w:val="left"/>
+      <w:pPr>
+        <w:tabs>
+          <w:tab w:val="num" w:pos="4320"/>
+        </w:tabs>
+        <w:ind w:left="4320" w:hanging="360"/>
+      </w:pPr>
+      <w:rPr>
+        <w:rFonts w:ascii="Wingdings" w:hAnsi="Wingdings" w:hint="default"/>
+        <w:sz w:val="20"/>
+      </w:rPr>
+    </w:lvl>
+    <w:lvl w:ilvl="6" w:tentative="1">
+      <w:start w:val="1"/>
+      <w:numFmt w:val="bullet"/>
+      <w:lvlText w:val=""/>
+      <w:lvlJc w:val="left"/>
+      <w:pPr>
+        <w:tabs>
+          <w:tab w:val="num" w:pos="5040"/>
+        </w:tabs>
+        <w:ind w:left="5040" w:hanging="360"/>
+      </w:pPr>
+      <w:rPr>
+        <w:rFonts w:ascii="Wingdings" w:hAnsi="Wingdings" w:hint="default"/>
+        <w:sz w:val="20"/>
+      </w:rPr>
+    </w:lvl>
+    <w:lvl w:ilvl="7" w:tentative="1">
+      <w:start w:val="1"/>
+      <w:numFmt w:val="bullet"/>
+      <w:lvlText w:val=""/>
+      <w:lvlJc w:val="left"/>
+      <w:pPr>
+        <w:tabs>
+          <w:tab w:val="num" w:pos="5760"/>
+        </w:tabs>
+        <w:ind w:left="5760" w:hanging="360"/>
+      </w:pPr>
+      <w:rPr>
+        <w:rFonts w:ascii="Wingdings" w:hAnsi="Wingdings" w:hint="default"/>
+        <w:sz w:val="20"/>
+      </w:rPr>
+    </w:lvl>
+    <w:lvl w:ilvl="8" w:tentative="1">
+      <w:start w:val="1"/>
+      <w:numFmt w:val="bullet"/>
+      <w:lvlText w:val=""/>
+      <w:lvlJc w:val="left"/>
+      <w:pPr>
+        <w:tabs>
+          <w:tab w:val="num" w:pos="6480"/>
+        </w:tabs>
+        <w:ind w:left="6480" w:hanging="360"/>
+      </w:pPr>
+      <w:rPr>
+        <w:rFonts w:ascii="Wingdings" w:hAnsi="Wingdings" w:hint="default"/>
+        <w:sz w:val="20"/>
+      </w:rPr>
+    </w:lvl>
+  </w:abstractNum>
+  <w:abstractNum w:abstractNumId="29" w15:restartNumberingAfterBreak="0">
     <w:nsid w:val="78C61806"/>
     <w:multiLevelType w:val="multilevel"/>
     <w:tmpl w:val="BD90F0C0"/>
@@ -17474,7 +19135,7 @@
       </w:rPr>
     </w:lvl>
   </w:abstractNum>
-  <w:abstractNum w:abstractNumId="29" w15:restartNumberingAfterBreak="0">
+  <w:abstractNum w:abstractNumId="30" w15:restartNumberingAfterBreak="0">
     <w:nsid w:val="7DCF3A56"/>
     <w:multiLevelType w:val="multilevel"/>
     <w:tmpl w:val="6F0A3806"/>
@@ -17623,7 +19284,7 @@
       </w:rPr>
     </w:lvl>
   </w:abstractNum>
-  <w:abstractNum w:abstractNumId="30" w15:restartNumberingAfterBreak="0">
+  <w:abstractNum w:abstractNumId="31" w15:restartNumberingAfterBreak="0">
     <w:nsid w:val="7E28183B"/>
     <w:multiLevelType w:val="multilevel"/>
     <w:tmpl w:val="67E2A9AA"/>
@@ -17772,7 +19433,7 @@
       </w:rPr>
     </w:lvl>
   </w:abstractNum>
-  <w:abstractNum w:abstractNumId="31" w15:restartNumberingAfterBreak="0">
+  <w:abstractNum w:abstractNumId="32" w15:restartNumberingAfterBreak="0">
     <w:nsid w:val="7E6B29BA"/>
     <w:multiLevelType w:val="multilevel"/>
     <w:tmpl w:val="17600516"/>
@@ -17931,10 +19592,10 @@
     <w:abstractNumId w:val="25"/>
   </w:num>
   <w:num w:numId="4" w16cid:durableId="994181492">
-    <w:abstractNumId w:val="30"/>
+    <w:abstractNumId w:val="31"/>
   </w:num>
   <w:num w:numId="5" w16cid:durableId="1043821426">
-    <w:abstractNumId w:val="28"/>
+    <w:abstractNumId w:val="29"/>
   </w:num>
   <w:num w:numId="6" w16cid:durableId="1469863382">
     <w:abstractNumId w:val="18"/>
@@ -17946,7 +19607,7 @@
     <w:abstractNumId w:val="14"/>
   </w:num>
   <w:num w:numId="9" w16cid:durableId="1364135561">
-    <w:abstractNumId w:val="29"/>
+    <w:abstractNumId w:val="30"/>
   </w:num>
   <w:num w:numId="10" w16cid:durableId="396126950">
     <w:abstractNumId w:val="23"/>
@@ -18000,7 +19661,7 @@
     <w:abstractNumId w:val="19"/>
   </w:num>
   <w:num w:numId="27" w16cid:durableId="1195583698">
-    <w:abstractNumId w:val="31"/>
+    <w:abstractNumId w:val="32"/>
   </w:num>
   <w:num w:numId="28" w16cid:durableId="1890680377">
     <w:abstractNumId w:val="16"/>
@@ -18016,6 +19677,9 @@
   </w:num>
   <w:num w:numId="32" w16cid:durableId="44842800">
     <w:abstractNumId w:val="13"/>
+  </w:num>
+  <w:num w:numId="33" w16cid:durableId="876820594">
+    <w:abstractNumId w:val="28"/>
   </w:num>
 </w:numbering>
 </file>

</xml_diff>